<commit_message>
Bloqueo estricto de rutas (Protected Routes)
</commit_message>
<xml_diff>
--- a/Plantilla_GDL.docx
+++ b/Plantilla_GDL.docx
@@ -45,21 +45,20 @@
         <w:gridCol w:w="13"/>
         <w:gridCol w:w="148"/>
         <w:gridCol w:w="43"/>
-        <w:gridCol w:w="196"/>
-        <w:gridCol w:w="318"/>
+        <w:gridCol w:w="374"/>
+        <w:gridCol w:w="140"/>
         <w:gridCol w:w="41"/>
-        <w:gridCol w:w="532"/>
-        <w:gridCol w:w="6"/>
-        <w:gridCol w:w="120"/>
+        <w:gridCol w:w="528"/>
+        <w:gridCol w:w="130"/>
         <w:gridCol w:w="14"/>
         <w:gridCol w:w="276"/>
         <w:gridCol w:w="34"/>
         <w:gridCol w:w="263"/>
         <w:gridCol w:w="277"/>
         <w:gridCol w:w="131"/>
-        <w:gridCol w:w="400"/>
-        <w:gridCol w:w="36"/>
-        <w:gridCol w:w="1034"/>
+        <w:gridCol w:w="436"/>
+        <w:gridCol w:w="140"/>
+        <w:gridCol w:w="894"/>
         <w:gridCol w:w="429"/>
         <w:gridCol w:w="75"/>
         <w:gridCol w:w="18"/>
@@ -143,7 +142,7 @@
         <w:tc>
           <w:tcPr>
             <w:tcW w:w="5042" w:type="dxa"/>
-            <w:gridSpan w:val="28"/>
+            <w:gridSpan w:val="27"/>
           </w:tcPr>
           <w:p>
             <w:pPr>
@@ -468,7 +467,7 @@
         <w:tc>
           <w:tcPr>
             <w:tcW w:w="1418" w:type="dxa"/>
-            <w:gridSpan w:val="9"/>
+            <w:gridSpan w:val="8"/>
             <w:tcBorders>
               <w:top w:val="threeDEngrave" w:sz="12" w:space="0" w:color="FFFFFF"/>
               <w:left w:val="threeDEngrave" w:sz="12" w:space="0" w:color="FFFFFF"/>
@@ -501,7 +500,7 @@
         <w:tc>
           <w:tcPr>
             <w:tcW w:w="1417" w:type="dxa"/>
-            <w:gridSpan w:val="7"/>
+            <w:gridSpan w:val="6"/>
             <w:tcBorders>
               <w:top w:val="threeDEngrave" w:sz="12" w:space="0" w:color="FFFFFF"/>
               <w:left w:val="threeDEngrave" w:sz="12" w:space="0" w:color="FFFFFF"/>
@@ -525,7 +524,7 @@
         <w:tc>
           <w:tcPr>
             <w:tcW w:w="1568" w:type="dxa"/>
-            <w:gridSpan w:val="5"/>
+            <w:gridSpan w:val="6"/>
             <w:tcBorders>
               <w:top w:val="threeDEngrave" w:sz="12" w:space="0" w:color="FFFFFF"/>
               <w:left w:val="threeDEngrave" w:sz="12" w:space="0" w:color="FFFFFF"/>
@@ -660,7 +659,7 @@
         <w:tc>
           <w:tcPr>
             <w:tcW w:w="1245" w:type="dxa"/>
-            <w:gridSpan w:val="7"/>
+            <w:gridSpan w:val="6"/>
             <w:tcBorders>
               <w:top w:val="threeDEngrave" w:sz="12" w:space="0" w:color="E6E6E6"/>
               <w:left w:val="threeDEngrave" w:sz="12" w:space="0" w:color="E6E6E6"/>
@@ -773,7 +772,7 @@
         <w:tc>
           <w:tcPr>
             <w:tcW w:w="7935" w:type="dxa"/>
-            <w:gridSpan w:val="39"/>
+            <w:gridSpan w:val="38"/>
             <w:tcBorders>
               <w:top w:val="threeDEngrave" w:sz="12" w:space="0" w:color="E6E6E6"/>
               <w:left w:val="threeDEngrave" w:sz="12" w:space="0" w:color="E6E6E6"/>
@@ -919,7 +918,7 @@
         <w:tc>
           <w:tcPr>
             <w:tcW w:w="5667" w:type="dxa"/>
-            <w:gridSpan w:val="28"/>
+            <w:gridSpan w:val="27"/>
             <w:tcBorders>
               <w:top w:val="threeDEngrave" w:sz="12" w:space="0" w:color="E6E6E6"/>
               <w:left w:val="threeDEngrave" w:sz="12" w:space="0" w:color="E6E6E6"/>
@@ -1010,7 +1009,7 @@
         <w:tc>
           <w:tcPr>
             <w:tcW w:w="5525" w:type="dxa"/>
-            <w:gridSpan w:val="26"/>
+            <w:gridSpan w:val="25"/>
             <w:tcBorders>
               <w:top w:val="threeDEngrave" w:sz="12" w:space="0" w:color="E6E6E6"/>
               <w:left w:val="threeDEngrave" w:sz="12" w:space="0" w:color="E6E6E6"/>
@@ -1096,7 +1095,7 @@
         <w:tc>
           <w:tcPr>
             <w:tcW w:w="5525" w:type="dxa"/>
-            <w:gridSpan w:val="26"/>
+            <w:gridSpan w:val="25"/>
             <w:tcBorders>
               <w:top w:val="threeDEngrave" w:sz="12" w:space="0" w:color="E6E6E6"/>
               <w:left w:val="threeDEngrave" w:sz="12" w:space="0" w:color="E6E6E6"/>
@@ -1176,7 +1175,7 @@
         <w:tc>
           <w:tcPr>
             <w:tcW w:w="6893" w:type="dxa"/>
-            <w:gridSpan w:val="33"/>
+            <w:gridSpan w:val="32"/>
             <w:tcBorders>
               <w:top w:val="threeDEngrave" w:sz="12" w:space="0" w:color="E6E6E6"/>
               <w:left w:val="threeDEngrave" w:sz="12" w:space="0" w:color="E6E6E6"/>
@@ -1254,7 +1253,7 @@
         <w:tc>
           <w:tcPr>
             <w:tcW w:w="9494" w:type="dxa"/>
-            <w:gridSpan w:val="46"/>
+            <w:gridSpan w:val="45"/>
             <w:tcBorders>
               <w:top w:val="threeDEngrave" w:sz="12" w:space="0" w:color="E6E6E6"/>
               <w:left w:val="threeDEngrave" w:sz="12" w:space="0" w:color="E6E6E6"/>
@@ -1342,7 +1341,7 @@
         <w:tc>
           <w:tcPr>
             <w:tcW w:w="9494" w:type="dxa"/>
-            <w:gridSpan w:val="46"/>
+            <w:gridSpan w:val="45"/>
             <w:tcBorders>
               <w:top w:val="threeDEngrave" w:sz="12" w:space="0" w:color="E6E6E6"/>
               <w:left w:val="threeDEngrave" w:sz="12" w:space="0" w:color="E6E6E6"/>
@@ -1545,7 +1544,7 @@
         <w:tc>
           <w:tcPr>
             <w:tcW w:w="1845" w:type="dxa"/>
-            <w:gridSpan w:val="13"/>
+            <w:gridSpan w:val="12"/>
             <w:tcBorders>
               <w:top w:val="threeDEngrave" w:sz="12" w:space="0" w:color="E6E6E6"/>
               <w:left w:val="threeDEngrave" w:sz="12" w:space="0" w:color="E6E6E6"/>
@@ -1648,7 +1647,7 @@
         <w:tc>
           <w:tcPr>
             <w:tcW w:w="9494" w:type="dxa"/>
-            <w:gridSpan w:val="46"/>
+            <w:gridSpan w:val="45"/>
             <w:tcBorders>
               <w:top w:val="threeDEngrave" w:sz="12" w:space="0" w:color="E6E6E6"/>
               <w:left w:val="threeDEngrave" w:sz="12" w:space="0" w:color="E6E6E6"/>
@@ -1737,7 +1736,7 @@
         <w:tc>
           <w:tcPr>
             <w:tcW w:w="8218" w:type="dxa"/>
-            <w:gridSpan w:val="42"/>
+            <w:gridSpan w:val="41"/>
             <w:tcBorders>
               <w:top w:val="threeDEngrave" w:sz="12" w:space="0" w:color="E6E6E6"/>
               <w:left w:val="threeDEngrave" w:sz="12" w:space="0" w:color="E6E6E6"/>
@@ -1825,8 +1824,8 @@
         </w:tc>
         <w:tc>
           <w:tcPr>
-            <w:tcW w:w="4686" w:type="dxa"/>
-            <w:gridSpan w:val="25"/>
+            <w:tcW w:w="4676" w:type="dxa"/>
+            <w:gridSpan w:val="24"/>
             <w:tcBorders>
               <w:top w:val="threeDEngrave" w:sz="12" w:space="0" w:color="E6E6E6"/>
               <w:left w:val="threeDEngrave" w:sz="12" w:space="0" w:color="E6E6E6"/>
@@ -1859,7 +1858,7 @@
         </w:tc>
         <w:tc>
           <w:tcPr>
-            <w:tcW w:w="984" w:type="dxa"/>
+            <w:tcW w:w="994" w:type="dxa"/>
             <w:gridSpan w:val="6"/>
             <w:tcBorders>
               <w:top w:val="threeDEngrave" w:sz="12" w:space="0" w:color="E6E6E6"/>
@@ -2078,7 +2077,7 @@
         <w:tc>
           <w:tcPr>
             <w:tcW w:w="1845" w:type="dxa"/>
-            <w:gridSpan w:val="13"/>
+            <w:gridSpan w:val="12"/>
             <w:tcBorders>
               <w:top w:val="threeDEngrave" w:sz="12" w:space="0" w:color="E6E6E6"/>
               <w:left w:val="threeDEngrave" w:sz="12" w:space="0" w:color="E6E6E6"/>
@@ -2191,26 +2190,987 @@
             <w:vAlign w:val="center"/>
           </w:tcPr>
           <w:p>
-            <w:r>
-              <w:rPr>
-                <w:rFonts w:ascii="Arial" w:hAnsi="Arial" w:cs="Arial"/>
-                <w:b/>
-                <w:color w:val="000000"/>
-                <w:sz w:val="14"/>
-                <w:szCs w:val="14"/>
+            <w:pPr>
+              <w:rPr>
+                <w:rFonts w:ascii="Arial" w:hAnsi="Arial" w:cs="Arial"/>
+                <w:sz w:val="13"/>
+                <w:szCs w:val="13"/>
+              </w:rPr>
+            </w:pPr>
+            <w:r>
+              <w:rPr>
+                <w:rFonts w:ascii="Arial" w:hAnsi="Arial" w:cs="Arial"/>
+                <w:b/>
+                <w:color w:val="000000"/>
+                <w:sz w:val="13"/>
+                <w:szCs w:val="13"/>
               </w:rPr>
               <w:t>Urbano</w:t>
             </w:r>
           </w:p>
         </w:tc>
-        <w:bookmarkStart w:id="0" w:name="__Fieldmark__27_310243481"/>
-        <w:tc>
-          <w:tcPr>
-            <w:tcW w:w="400" w:type="dxa"/>
+        <w:tc>
+          <w:tcPr>
+            <w:tcW w:w="578" w:type="dxa"/>
             <w:gridSpan w:val="4"/>
             <w:tcBorders>
               <w:top w:val="threeDEngrave" w:sz="12" w:space="0" w:color="FFFFFF"/>
               <w:left w:val="threeDEngrave" w:sz="12" w:space="0" w:color="FFFFFF"/>
+              <w:bottom w:val="threeDEngrave" w:sz="12" w:space="0" w:color="FFFFFF"/>
+            </w:tcBorders>
+            <w:vAlign w:val="center"/>
+          </w:tcPr>
+          <w:p>
+            <w:pPr>
+              <w:rPr>
+                <w:rFonts w:ascii="Arial" w:hAnsi="Arial" w:cs="Arial"/>
+                <w:sz w:val="17"/>
+                <w:szCs w:val="17"/>
+              </w:rPr>
+            </w:pPr>
+            <w:r>
+              <w:rPr>
+                <w:rFonts w:ascii="Arial" w:hAnsi="Arial" w:cs="Arial"/>
+                <w:sz w:val="17"/>
+                <w:szCs w:val="17"/>
+              </w:rPr>
+              <w:t xml:space="preserve"> </w:t>
+            </w:r>
+            <w:r>
+              <w:rPr>
+                <w:rFonts w:ascii="Arial" w:hAnsi="Arial" w:cs="Arial"/>
+                <w:b/>
+                <w:bCs/>
+                <w:sz w:val="17"/>
+                <w:szCs w:val="17"/>
+              </w:rPr>
+              <w:t>[</w:t>
+            </w:r>
+            <w:r>
+              <w:rPr>
+                <w:rFonts w:ascii="Arial" w:hAnsi="Arial" w:cs="Arial"/>
+                <w:sz w:val="17"/>
+                <w:szCs w:val="17"/>
+              </w:rPr>
+              <w:t xml:space="preserve"> {{ x_urbano }} </w:t>
+            </w:r>
+            <w:r>
+              <w:rPr>
+                <w:rFonts w:ascii="Arial" w:hAnsi="Arial" w:cs="Arial"/>
+                <w:b/>
+                <w:bCs/>
+                <w:sz w:val="17"/>
+                <w:szCs w:val="17"/>
+              </w:rPr>
+              <w:t>]</w:t>
+            </w:r>
+          </w:p>
+        </w:tc>
+        <w:tc>
+          <w:tcPr>
+            <w:tcW w:w="709" w:type="dxa"/>
+            <w:gridSpan w:val="3"/>
+            <w:tcBorders>
+              <w:top w:val="threeDEngrave" w:sz="12" w:space="0" w:color="FFFFFF"/>
+              <w:left w:val="threeDEngrave" w:sz="12" w:space="0" w:color="FFFFFF"/>
+              <w:bottom w:val="threeDEngrave" w:sz="12" w:space="0" w:color="FFFFFF"/>
+            </w:tcBorders>
+            <w:vAlign w:val="center"/>
+          </w:tcPr>
+          <w:p>
+            <w:pPr>
+              <w:rPr>
+                <w:rFonts w:ascii="Arial" w:hAnsi="Arial" w:cs="Arial"/>
+                <w:sz w:val="13"/>
+                <w:szCs w:val="13"/>
+              </w:rPr>
+            </w:pPr>
+            <w:r>
+              <w:rPr>
+                <w:rFonts w:ascii="Arial" w:hAnsi="Arial" w:cs="Arial"/>
+                <w:b/>
+                <w:color w:val="000000"/>
+                <w:sz w:val="13"/>
+                <w:szCs w:val="13"/>
+              </w:rPr>
+              <w:t>Rústico</w:t>
+            </w:r>
+          </w:p>
+        </w:tc>
+        <w:tc>
+          <w:tcPr>
+            <w:tcW w:w="420" w:type="dxa"/>
+            <w:gridSpan w:val="3"/>
+            <w:tcBorders>
+              <w:top w:val="threeDEngrave" w:sz="12" w:space="0" w:color="FFFFFF"/>
+              <w:left w:val="threeDEngrave" w:sz="12" w:space="0" w:color="FFFFFF"/>
+              <w:bottom w:val="threeDEngrave" w:sz="12" w:space="0" w:color="FFFFFF"/>
+            </w:tcBorders>
+            <w:vAlign w:val="center"/>
+          </w:tcPr>
+          <w:p>
+            <w:pPr>
+              <w:rPr>
+                <w:rFonts w:ascii="Arial" w:hAnsi="Arial" w:cs="Arial"/>
+                <w:sz w:val="17"/>
+                <w:szCs w:val="17"/>
+              </w:rPr>
+            </w:pPr>
+            <w:r>
+              <w:rPr>
+                <w:rFonts w:ascii="Arial" w:hAnsi="Arial" w:cs="Arial"/>
+                <w:sz w:val="17"/>
+                <w:szCs w:val="17"/>
+              </w:rPr>
+              <w:t xml:space="preserve"> </w:t>
+            </w:r>
+            <w:r>
+              <w:rPr>
+                <w:rFonts w:ascii="Arial" w:hAnsi="Arial" w:cs="Arial"/>
+                <w:b/>
+                <w:bCs/>
+                <w:sz w:val="17"/>
+                <w:szCs w:val="17"/>
+              </w:rPr>
+              <w:t>[</w:t>
+            </w:r>
+            <w:r>
+              <w:rPr>
+                <w:rFonts w:ascii="Arial" w:hAnsi="Arial" w:cs="Arial"/>
+                <w:sz w:val="17"/>
+                <w:szCs w:val="17"/>
+              </w:rPr>
+              <w:t xml:space="preserve"> {{ x_</w:t>
+            </w:r>
+            <w:r>
+              <w:rPr>
+                <w:rFonts w:ascii="Arial" w:hAnsi="Arial" w:cs="Arial"/>
+                <w:sz w:val="17"/>
+                <w:szCs w:val="17"/>
+              </w:rPr>
+              <w:t>rustico</w:t>
+            </w:r>
+            <w:r>
+              <w:rPr>
+                <w:rFonts w:ascii="Arial" w:hAnsi="Arial" w:cs="Arial"/>
+                <w:sz w:val="17"/>
+                <w:szCs w:val="17"/>
+              </w:rPr>
+              <w:t xml:space="preserve"> }}</w:t>
+            </w:r>
+            <w:r>
+              <w:rPr>
+                <w:rFonts w:ascii="Arial" w:hAnsi="Arial" w:cs="Arial"/>
+                <w:sz w:val="17"/>
+                <w:szCs w:val="17"/>
+              </w:rPr>
+              <w:t xml:space="preserve"> </w:t>
+            </w:r>
+            <w:r>
+              <w:rPr>
+                <w:rFonts w:ascii="Arial" w:hAnsi="Arial" w:cs="Arial"/>
+                <w:b/>
+                <w:bCs/>
+                <w:sz w:val="17"/>
+                <w:szCs w:val="17"/>
+              </w:rPr>
+              <w:t>]</w:t>
+            </w:r>
+            <w:r>
+              <w:rPr>
+                <w:rFonts w:ascii="Arial" w:hAnsi="Arial" w:cs="Arial"/>
+                <w:sz w:val="17"/>
+                <w:szCs w:val="17"/>
+              </w:rPr>
+              <w:t xml:space="preserve"> </w:t>
+            </w:r>
+          </w:p>
+        </w:tc>
+        <w:tc>
+          <w:tcPr>
+            <w:tcW w:w="705" w:type="dxa"/>
+            <w:gridSpan w:val="4"/>
+            <w:tcBorders>
+              <w:top w:val="threeDEngrave" w:sz="12" w:space="0" w:color="FFFFFF"/>
+              <w:left w:val="threeDEngrave" w:sz="12" w:space="0" w:color="FFFFFF"/>
+              <w:bottom w:val="threeDEngrave" w:sz="12" w:space="0" w:color="FFFFFF"/>
+            </w:tcBorders>
+            <w:vAlign w:val="center"/>
+          </w:tcPr>
+          <w:p>
+            <w:pPr>
+              <w:rPr>
+                <w:rFonts w:ascii="Arial" w:hAnsi="Arial" w:cs="Arial"/>
+                <w:sz w:val="13"/>
+                <w:szCs w:val="13"/>
+              </w:rPr>
+            </w:pPr>
+            <w:r>
+              <w:rPr>
+                <w:rFonts w:ascii="Arial" w:hAnsi="Arial" w:cs="Arial"/>
+                <w:b/>
+                <w:color w:val="000000"/>
+                <w:sz w:val="13"/>
+                <w:szCs w:val="13"/>
+              </w:rPr>
+              <w:t>Baldío</w:t>
+            </w:r>
+          </w:p>
+        </w:tc>
+        <w:tc>
+          <w:tcPr>
+            <w:tcW w:w="576" w:type="dxa"/>
+            <w:gridSpan w:val="2"/>
+            <w:tcBorders>
+              <w:top w:val="threeDEngrave" w:sz="12" w:space="0" w:color="FFFFFF"/>
+              <w:left w:val="threeDEngrave" w:sz="12" w:space="0" w:color="FFFFFF"/>
+              <w:bottom w:val="threeDEngrave" w:sz="12" w:space="0" w:color="FFFFFF"/>
+            </w:tcBorders>
+            <w:vAlign w:val="center"/>
+          </w:tcPr>
+          <w:p>
+            <w:pPr>
+              <w:rPr>
+                <w:rFonts w:ascii="Arial" w:hAnsi="Arial" w:cs="Arial"/>
+              </w:rPr>
+            </w:pPr>
+            <w:r>
+              <w:rPr>
+                <w:rFonts w:ascii="Arial" w:hAnsi="Arial" w:cs="Arial"/>
+                <w:sz w:val="18"/>
+                <w:szCs w:val="18"/>
+              </w:rPr>
+              <w:t xml:space="preserve"> </w:t>
+            </w:r>
+            <w:r>
+              <w:rPr>
+                <w:rFonts w:ascii="Arial" w:hAnsi="Arial" w:cs="Arial"/>
+                <w:b/>
+                <w:bCs/>
+                <w:sz w:val="17"/>
+                <w:szCs w:val="17"/>
+              </w:rPr>
+              <w:t>[</w:t>
+            </w:r>
+            <w:r>
+              <w:rPr>
+                <w:rFonts w:ascii="Arial" w:hAnsi="Arial" w:cs="Arial"/>
+                <w:sz w:val="17"/>
+                <w:szCs w:val="17"/>
+              </w:rPr>
+              <w:t xml:space="preserve"> </w:t>
+            </w:r>
+            <w:r>
+              <w:rPr>
+                <w:rFonts w:ascii="Arial" w:hAnsi="Arial" w:cs="Arial"/>
+                <w:sz w:val="18"/>
+                <w:szCs w:val="18"/>
+              </w:rPr>
+              <w:t>{{ x_</w:t>
+            </w:r>
+            <w:r>
+              <w:rPr>
+                <w:rFonts w:ascii="Arial" w:hAnsi="Arial" w:cs="Arial"/>
+                <w:sz w:val="18"/>
+                <w:szCs w:val="18"/>
+              </w:rPr>
+              <w:t>baldio</w:t>
+            </w:r>
+            <w:r>
+              <w:rPr>
+                <w:rFonts w:ascii="Arial" w:hAnsi="Arial" w:cs="Arial"/>
+                <w:sz w:val="18"/>
+                <w:szCs w:val="18"/>
+              </w:rPr>
+              <w:t xml:space="preserve"> }} </w:t>
+            </w:r>
+            <w:r>
+              <w:rPr>
+                <w:rFonts w:ascii="Arial" w:hAnsi="Arial" w:cs="Arial"/>
+                <w:b/>
+                <w:bCs/>
+                <w:sz w:val="18"/>
+                <w:szCs w:val="18"/>
+              </w:rPr>
+              <w:t>]</w:t>
+            </w:r>
+          </w:p>
+        </w:tc>
+        <w:tc>
+          <w:tcPr>
+            <w:tcW w:w="894" w:type="dxa"/>
+            <w:tcBorders>
+              <w:top w:val="threeDEngrave" w:sz="12" w:space="0" w:color="FFFFFF"/>
+              <w:left w:val="threeDEngrave" w:sz="12" w:space="0" w:color="FFFFFF"/>
+              <w:bottom w:val="threeDEngrave" w:sz="12" w:space="0" w:color="FFFFFF"/>
+            </w:tcBorders>
+            <w:vAlign w:val="center"/>
+          </w:tcPr>
+          <w:p>
+            <w:pPr>
+              <w:rPr>
+                <w:rFonts w:ascii="Arial" w:hAnsi="Arial" w:cs="Arial"/>
+                <w:sz w:val="12"/>
+                <w:szCs w:val="12"/>
+              </w:rPr>
+            </w:pPr>
+            <w:r>
+              <w:rPr>
+                <w:rFonts w:ascii="Arial" w:hAnsi="Arial" w:cs="Arial"/>
+                <w:b/>
+                <w:color w:val="000000"/>
+                <w:sz w:val="12"/>
+                <w:szCs w:val="12"/>
+              </w:rPr>
+              <w:t>Construido</w:t>
+            </w:r>
+          </w:p>
+        </w:tc>
+        <w:tc>
+          <w:tcPr>
+            <w:tcW w:w="522" w:type="dxa"/>
+            <w:gridSpan w:val="3"/>
+            <w:tcBorders>
+              <w:top w:val="threeDEngrave" w:sz="12" w:space="0" w:color="FFFFFF"/>
+              <w:left w:val="threeDEngrave" w:sz="12" w:space="0" w:color="FFFFFF"/>
+              <w:bottom w:val="threeDEngrave" w:sz="12" w:space="0" w:color="FFFFFF"/>
+              <w:right w:val="threeDEngrave" w:sz="12" w:space="0" w:color="FFFFFF"/>
+            </w:tcBorders>
+            <w:vAlign w:val="center"/>
+          </w:tcPr>
+          <w:p>
+            <w:pPr>
+              <w:rPr>
+                <w:rFonts w:ascii="Arial" w:hAnsi="Arial" w:cs="Arial"/>
+                <w:sz w:val="17"/>
+                <w:szCs w:val="17"/>
+              </w:rPr>
+            </w:pPr>
+            <w:r>
+              <w:rPr>
+                <w:rFonts w:ascii="Arial" w:hAnsi="Arial" w:cs="Arial"/>
+                <w:sz w:val="17"/>
+                <w:szCs w:val="17"/>
+              </w:rPr>
+              <w:t xml:space="preserve"> </w:t>
+            </w:r>
+            <w:r>
+              <w:rPr>
+                <w:rFonts w:ascii="Arial" w:hAnsi="Arial" w:cs="Arial"/>
+                <w:b/>
+                <w:bCs/>
+                <w:sz w:val="17"/>
+                <w:szCs w:val="17"/>
+              </w:rPr>
+              <w:t>[</w:t>
+            </w:r>
+            <w:r>
+              <w:rPr>
+                <w:rFonts w:ascii="Arial" w:hAnsi="Arial" w:cs="Arial"/>
+                <w:sz w:val="17"/>
+                <w:szCs w:val="17"/>
+              </w:rPr>
+              <w:t xml:space="preserve"> </w:t>
+            </w:r>
+            <w:r>
+              <w:rPr>
+                <w:rFonts w:ascii="Arial" w:hAnsi="Arial" w:cs="Arial"/>
+                <w:sz w:val="17"/>
+                <w:szCs w:val="17"/>
+              </w:rPr>
+              <w:t>{{ x_</w:t>
+            </w:r>
+            <w:r>
+              <w:rPr>
+                <w:rFonts w:ascii="Arial" w:hAnsi="Arial" w:cs="Arial"/>
+                <w:sz w:val="17"/>
+                <w:szCs w:val="17"/>
+              </w:rPr>
+              <w:t>construido</w:t>
+            </w:r>
+            <w:r>
+              <w:rPr>
+                <w:rFonts w:ascii="Arial" w:hAnsi="Arial" w:cs="Arial"/>
+                <w:sz w:val="17"/>
+                <w:szCs w:val="17"/>
+              </w:rPr>
+              <w:t xml:space="preserve"> }} </w:t>
+            </w:r>
+            <w:r>
+              <w:rPr>
+                <w:rFonts w:ascii="Arial" w:hAnsi="Arial" w:cs="Arial"/>
+                <w:b/>
+                <w:bCs/>
+                <w:sz w:val="17"/>
+                <w:szCs w:val="17"/>
+              </w:rPr>
+              <w:t>]</w:t>
+            </w:r>
+          </w:p>
+        </w:tc>
+      </w:tr>
+      <w:tr>
+        <w:tblPrEx>
+          <w:tblCellMar>
+            <w:left w:w="108" w:type="dxa"/>
+            <w:right w:w="108" w:type="dxa"/>
+          </w:tblCellMar>
+        </w:tblPrEx>
+        <w:trPr>
+          <w:gridAfter w:val="1"/>
+          <w:wAfter w:w="12" w:type="dxa"/>
+        </w:trPr>
+        <w:tc>
+          <w:tcPr>
+            <w:tcW w:w="236" w:type="dxa"/>
+          </w:tcPr>
+          <w:p>
+            <w:pPr>
+              <w:snapToGrid w:val="0"/>
+            </w:pPr>
+          </w:p>
+        </w:tc>
+        <w:tc>
+          <w:tcPr>
+            <w:tcW w:w="2695" w:type="dxa"/>
+            <w:gridSpan w:val="6"/>
+            <w:tcBorders>
+              <w:top w:val="threeDEngrave" w:sz="12" w:space="0" w:color="FFFFFF"/>
+              <w:left w:val="threeDEngrave" w:sz="12" w:space="0" w:color="FFFFFF"/>
+              <w:bottom w:val="threeDEngrave" w:sz="12" w:space="0" w:color="FFFFFF"/>
+            </w:tcBorders>
+            <w:shd w:val="clear" w:color="auto" w:fill="D9D9D9"/>
+            <w:vAlign w:val="center"/>
+          </w:tcPr>
+          <w:p>
+            <w:r>
+              <w:rPr>
+                <w:rFonts w:ascii="Arial" w:hAnsi="Arial" w:cs="Arial"/>
+                <w:b/>
+                <w:color w:val="000000"/>
+                <w:sz w:val="14"/>
+                <w:szCs w:val="14"/>
+              </w:rPr>
+              <w:t>Lo transmitido constituye :</w:t>
+            </w:r>
+          </w:p>
+        </w:tc>
+        <w:tc>
+          <w:tcPr>
+            <w:tcW w:w="937" w:type="dxa"/>
+            <w:gridSpan w:val="6"/>
+            <w:tcBorders>
+              <w:top w:val="threeDEngrave" w:sz="12" w:space="0" w:color="FFFFFF"/>
+              <w:left w:val="threeDEngrave" w:sz="12" w:space="0" w:color="FFFFFF"/>
+              <w:bottom w:val="threeDEngrave" w:sz="12" w:space="0" w:color="FFFFFF"/>
+            </w:tcBorders>
+            <w:vAlign w:val="center"/>
+          </w:tcPr>
+          <w:p>
+            <w:r>
+              <w:rPr>
+                <w:rFonts w:ascii="Arial" w:hAnsi="Arial" w:cs="Arial"/>
+                <w:b/>
+                <w:color w:val="000000"/>
+                <w:sz w:val="14"/>
+                <w:szCs w:val="14"/>
+              </w:rPr>
+              <w:t>Fracción:</w:t>
+            </w:r>
+          </w:p>
+        </w:tc>
+        <w:tc>
+          <w:tcPr>
+            <w:tcW w:w="401" w:type="dxa"/>
+            <w:gridSpan w:val="3"/>
+            <w:tcBorders>
+              <w:top w:val="threeDEngrave" w:sz="12" w:space="0" w:color="FFFFFF"/>
+              <w:left w:val="threeDEngrave" w:sz="12" w:space="0" w:color="FFFFFF"/>
+              <w:bottom w:val="threeDEngrave" w:sz="12" w:space="0" w:color="FFFFFF"/>
+            </w:tcBorders>
+            <w:vAlign w:val="center"/>
+          </w:tcPr>
+          <w:p>
+            <w:pPr>
+              <w:rPr>
+                <w:b/>
+                <w:bCs/>
+                <w:sz w:val="14"/>
+                <w:szCs w:val="14"/>
+              </w:rPr>
+            </w:pPr>
+            <w:r>
+              <w:rPr>
+                <w:b/>
+                <w:bCs/>
+                <w:sz w:val="14"/>
+                <w:szCs w:val="14"/>
+              </w:rPr>
+              <w:t>[ {{ x_fraccion }} ]</w:t>
+            </w:r>
+          </w:p>
+        </w:tc>
+        <w:tc>
+          <w:tcPr>
+            <w:tcW w:w="755" w:type="dxa"/>
+            <w:gridSpan w:val="2"/>
+            <w:tcBorders>
+              <w:top w:val="threeDEngrave" w:sz="12" w:space="0" w:color="FFFFFF"/>
+              <w:left w:val="threeDEngrave" w:sz="12" w:space="0" w:color="FFFFFF"/>
+              <w:bottom w:val="threeDEngrave" w:sz="12" w:space="0" w:color="FFFFFF"/>
+            </w:tcBorders>
+            <w:vAlign w:val="center"/>
+          </w:tcPr>
+          <w:p>
+            <w:r>
+              <w:rPr>
+                <w:rFonts w:ascii="Arial" w:hAnsi="Arial" w:cs="Arial"/>
+                <w:b/>
+                <w:color w:val="000000"/>
+                <w:sz w:val="14"/>
+                <w:szCs w:val="14"/>
+              </w:rPr>
+              <w:t>Resto:</w:t>
+            </w:r>
+          </w:p>
+        </w:tc>
+        <w:tc>
+          <w:tcPr>
+            <w:tcW w:w="450" w:type="dxa"/>
+            <w:gridSpan w:val="3"/>
+            <w:tcBorders>
+              <w:top w:val="threeDEngrave" w:sz="12" w:space="0" w:color="FFFFFF"/>
+              <w:left w:val="threeDEngrave" w:sz="12" w:space="0" w:color="FFFFFF"/>
+              <w:bottom w:val="threeDEngrave" w:sz="12" w:space="0" w:color="FFFFFF"/>
+            </w:tcBorders>
+            <w:vAlign w:val="center"/>
+          </w:tcPr>
+          <w:p>
+            <w:r>
+              <w:rPr>
+                <w:b/>
+                <w:bCs/>
+                <w:sz w:val="14"/>
+                <w:szCs w:val="14"/>
+              </w:rPr>
+              <w:t>[ {{ x_</w:t>
+            </w:r>
+            <w:r>
+              <w:rPr>
+                <w:b/>
+                <w:bCs/>
+                <w:sz w:val="14"/>
+                <w:szCs w:val="14"/>
+              </w:rPr>
+              <w:t>resto</w:t>
+            </w:r>
+            <w:r>
+              <w:rPr>
+                <w:b/>
+                <w:bCs/>
+                <w:sz w:val="14"/>
+                <w:szCs w:val="14"/>
+              </w:rPr>
+              <w:t xml:space="preserve"> }} ]</w:t>
+            </w:r>
+          </w:p>
+        </w:tc>
+        <w:tc>
+          <w:tcPr>
+            <w:tcW w:w="990" w:type="dxa"/>
+            <w:gridSpan w:val="5"/>
+            <w:tcBorders>
+              <w:top w:val="threeDEngrave" w:sz="12" w:space="0" w:color="FFFFFF"/>
+              <w:left w:val="threeDEngrave" w:sz="12" w:space="0" w:color="FFFFFF"/>
+              <w:bottom w:val="threeDEngrave" w:sz="12" w:space="0" w:color="FFFFFF"/>
+            </w:tcBorders>
+            <w:vAlign w:val="center"/>
+          </w:tcPr>
+          <w:p>
+            <w:r>
+              <w:rPr>
+                <w:rFonts w:ascii="Arial" w:hAnsi="Arial" w:cs="Arial"/>
+                <w:b/>
+                <w:color w:val="000000"/>
+                <w:sz w:val="14"/>
+                <w:szCs w:val="14"/>
+              </w:rPr>
+              <w:t>Totalidad:</w:t>
+            </w:r>
+          </w:p>
+        </w:tc>
+        <w:tc>
+          <w:tcPr>
+            <w:tcW w:w="450" w:type="dxa"/>
+            <w:gridSpan w:val="4"/>
+            <w:tcBorders>
+              <w:top w:val="threeDEngrave" w:sz="12" w:space="0" w:color="FFFFFF"/>
+              <w:left w:val="threeDEngrave" w:sz="12" w:space="0" w:color="FFFFFF"/>
+              <w:bottom w:val="threeDEngrave" w:sz="12" w:space="0" w:color="FFFFFF"/>
+            </w:tcBorders>
+            <w:vAlign w:val="center"/>
+          </w:tcPr>
+          <w:p>
+            <w:r>
+              <w:rPr>
+                <w:b/>
+                <w:bCs/>
+                <w:sz w:val="14"/>
+                <w:szCs w:val="14"/>
+              </w:rPr>
+              <w:t>[ {{ x_</w:t>
+            </w:r>
+            <w:r>
+              <w:rPr>
+                <w:b/>
+                <w:bCs/>
+                <w:sz w:val="14"/>
+                <w:szCs w:val="14"/>
+              </w:rPr>
+              <w:t>totalidad</w:t>
+            </w:r>
+            <w:r>
+              <w:rPr>
+                <w:b/>
+                <w:bCs/>
+                <w:sz w:val="14"/>
+                <w:szCs w:val="14"/>
+              </w:rPr>
+              <w:t xml:space="preserve"> }} ]</w:t>
+            </w:r>
+          </w:p>
+        </w:tc>
+        <w:tc>
+          <w:tcPr>
+            <w:tcW w:w="4200" w:type="dxa"/>
+            <w:gridSpan w:val="17"/>
+            <w:tcBorders>
+              <w:top w:val="threeDEngrave" w:sz="12" w:space="0" w:color="FFFFFF"/>
+              <w:left w:val="threeDEngrave" w:sz="12" w:space="0" w:color="FFFFFF"/>
+              <w:bottom w:val="threeDEngrave" w:sz="12" w:space="0" w:color="FFFFFF"/>
+              <w:right w:val="threeDEngrave" w:sz="12" w:space="0" w:color="FFFFFF"/>
+            </w:tcBorders>
+            <w:vAlign w:val="center"/>
+          </w:tcPr>
+          <w:p>
+            <w:r>
+              <w:rPr>
+                <w:rFonts w:ascii="Arial" w:hAnsi="Arial" w:cs="Arial"/>
+                <w:b/>
+                <w:color w:val="000000"/>
+                <w:sz w:val="14"/>
+                <w:szCs w:val="14"/>
+              </w:rPr>
+              <w:t>en relación con el título inmediato anterior.</w:t>
+            </w:r>
+          </w:p>
+        </w:tc>
+      </w:tr>
+      <w:tr>
+        <w:tblPrEx>
+          <w:tblCellMar>
+            <w:left w:w="108" w:type="dxa"/>
+            <w:right w:w="108" w:type="dxa"/>
+          </w:tblCellMar>
+        </w:tblPrEx>
+        <w:trPr>
+          <w:gridAfter w:val="1"/>
+          <w:wAfter w:w="12" w:type="dxa"/>
+        </w:trPr>
+        <w:tc>
+          <w:tcPr>
+            <w:tcW w:w="236" w:type="dxa"/>
+          </w:tcPr>
+          <w:p>
+            <w:pPr>
+              <w:snapToGrid w:val="0"/>
+            </w:pPr>
+          </w:p>
+        </w:tc>
+        <w:tc>
+          <w:tcPr>
+            <w:tcW w:w="10878" w:type="dxa"/>
+            <w:gridSpan w:val="46"/>
+            <w:tcBorders>
+              <w:top w:val="threeDEngrave" w:sz="12" w:space="0" w:color="E6E6E6"/>
+              <w:left w:val="threeDEngrave" w:sz="12" w:space="0" w:color="E6E6E6"/>
+              <w:bottom w:val="threeDEngrave" w:sz="12" w:space="0" w:color="E6E6E6"/>
+              <w:right w:val="threeDEngrave" w:sz="12" w:space="0" w:color="E6E6E6"/>
+            </w:tcBorders>
+            <w:shd w:val="clear" w:color="auto" w:fill="D9D9D9"/>
+            <w:vAlign w:val="center"/>
+          </w:tcPr>
+          <w:p>
+            <w:r>
+              <w:rPr>
+                <w:rFonts w:ascii="Arial" w:hAnsi="Arial" w:cs="Arial"/>
+                <w:b/>
+                <w:color w:val="000000"/>
+                <w:sz w:val="14"/>
+                <w:szCs w:val="14"/>
+              </w:rPr>
+              <w:t>Ubicación, medidas y linderos:</w:t>
+            </w:r>
+          </w:p>
+        </w:tc>
+      </w:tr>
+      <w:tr>
+        <w:tblPrEx>
+          <w:tblCellMar>
+            <w:left w:w="108" w:type="dxa"/>
+            <w:right w:w="108" w:type="dxa"/>
+          </w:tblCellMar>
+        </w:tblPrEx>
+        <w:trPr>
+          <w:gridAfter w:val="1"/>
+          <w:wAfter w:w="12" w:type="dxa"/>
+        </w:trPr>
+        <w:tc>
+          <w:tcPr>
+            <w:tcW w:w="236" w:type="dxa"/>
+          </w:tcPr>
+          <w:p>
+            <w:pPr>
+              <w:snapToGrid w:val="0"/>
+            </w:pPr>
+          </w:p>
+        </w:tc>
+        <w:tc>
+          <w:tcPr>
+            <w:tcW w:w="10878" w:type="dxa"/>
+            <w:gridSpan w:val="46"/>
+            <w:tcBorders>
+              <w:top w:val="threeDEngrave" w:sz="12" w:space="0" w:color="E6E6E6"/>
+              <w:left w:val="threeDEngrave" w:sz="12" w:space="0" w:color="E6E6E6"/>
+              <w:bottom w:val="threeDEngrave" w:sz="12" w:space="0" w:color="E6E6E6"/>
+              <w:right w:val="threeDEngrave" w:sz="12" w:space="0" w:color="E6E6E6"/>
+            </w:tcBorders>
+            <w:vAlign w:val="center"/>
+          </w:tcPr>
+          <w:p>
+            <w:pPr>
+              <w:snapToGrid w:val="0"/>
+              <w:rPr>
+                <w:rFonts w:ascii="Arial" w:hAnsi="Arial" w:cs="Arial"/>
+                <w:b/>
+                <w:color w:val="000000"/>
+                <w:sz w:val="14"/>
+                <w:szCs w:val="14"/>
+              </w:rPr>
+            </w:pPr>
+            <w:r>
+              <w:rPr>
+                <w:rFonts w:ascii="Arial" w:hAnsi="Arial" w:cs="Arial"/>
+                <w:b/>
+                <w:color w:val="000000"/>
+                <w:sz w:val="14"/>
+                <w:szCs w:val="14"/>
+              </w:rPr>
+              <w:t>{{ ubicacion_inmueble }}</w:t>
+            </w:r>
+          </w:p>
+        </w:tc>
+      </w:tr>
+      <w:tr>
+        <w:tblPrEx>
+          <w:tblCellMar>
+            <w:left w:w="108" w:type="dxa"/>
+            <w:right w:w="108" w:type="dxa"/>
+          </w:tblCellMar>
+        </w:tblPrEx>
+        <w:trPr>
+          <w:gridAfter w:val="1"/>
+          <w:wAfter w:w="12" w:type="dxa"/>
+        </w:trPr>
+        <w:tc>
+          <w:tcPr>
+            <w:tcW w:w="236" w:type="dxa"/>
+          </w:tcPr>
+          <w:p>
+            <w:pPr>
+              <w:snapToGrid w:val="0"/>
+              <w:rPr>
+                <w:rFonts w:ascii="Arial" w:hAnsi="Arial" w:cs="Arial"/>
+                <w:b/>
+                <w:color w:val="000000"/>
+                <w:sz w:val="16"/>
+                <w:szCs w:val="16"/>
+              </w:rPr>
+            </w:pPr>
+          </w:p>
+        </w:tc>
+        <w:tc>
+          <w:tcPr>
+            <w:tcW w:w="10878" w:type="dxa"/>
+            <w:gridSpan w:val="46"/>
+            <w:tcBorders>
+              <w:top w:val="threeDEngrave" w:sz="12" w:space="0" w:color="E6E6E6"/>
+              <w:left w:val="threeDEngrave" w:sz="12" w:space="0" w:color="E6E6E6"/>
+              <w:bottom w:val="threeDEngrave" w:sz="12" w:space="0" w:color="E6E6E6"/>
+              <w:right w:val="threeDEngrave" w:sz="12" w:space="0" w:color="E6E6E6"/>
+            </w:tcBorders>
+            <w:shd w:val="clear" w:color="auto" w:fill="D9D9D9"/>
+            <w:vAlign w:val="center"/>
+          </w:tcPr>
+          <w:p>
+            <w:r>
+              <w:rPr>
+                <w:rFonts w:ascii="Arial" w:hAnsi="Arial" w:cs="Arial"/>
+                <w:b/>
+                <w:color w:val="000000"/>
+                <w:sz w:val="14"/>
+                <w:szCs w:val="14"/>
+              </w:rPr>
+              <w:t>Procedencia o antecedentes de la adquisición (incluir Datos de Registro Público de la Propiedad en caso de no contar con Folio Real):</w:t>
+            </w:r>
+          </w:p>
+        </w:tc>
+      </w:tr>
+      <w:tr>
+        <w:tblPrEx>
+          <w:tblCellMar>
+            <w:left w:w="108" w:type="dxa"/>
+            <w:right w:w="108" w:type="dxa"/>
+          </w:tblCellMar>
+        </w:tblPrEx>
+        <w:trPr>
+          <w:gridAfter w:val="1"/>
+          <w:wAfter w:w="12" w:type="dxa"/>
+        </w:trPr>
+        <w:tc>
+          <w:tcPr>
+            <w:tcW w:w="236" w:type="dxa"/>
+          </w:tcPr>
+          <w:p>
+            <w:pPr>
+              <w:snapToGrid w:val="0"/>
+            </w:pPr>
+          </w:p>
+        </w:tc>
+        <w:tc>
+          <w:tcPr>
+            <w:tcW w:w="10878" w:type="dxa"/>
+            <w:gridSpan w:val="46"/>
+            <w:tcBorders>
+              <w:top w:val="threeDEngrave" w:sz="12" w:space="0" w:color="E6E6E6"/>
+              <w:left w:val="threeDEngrave" w:sz="12" w:space="0" w:color="E6E6E6"/>
+              <w:bottom w:val="threeDEngrave" w:sz="12" w:space="0" w:color="E6E6E6"/>
+              <w:right w:val="threeDEngrave" w:sz="12" w:space="0" w:color="E6E6E6"/>
+            </w:tcBorders>
+            <w:vAlign w:val="center"/>
+          </w:tcPr>
+          <w:p>
+            <w:pPr>
+              <w:snapToGrid w:val="0"/>
+              <w:rPr>
+                <w:rFonts w:ascii="Arial" w:hAnsi="Arial" w:cs="Arial"/>
+                <w:b/>
+                <w:color w:val="000000"/>
+                <w:sz w:val="14"/>
+                <w:szCs w:val="14"/>
+              </w:rPr>
+            </w:pPr>
+            <w:r>
+              <w:rPr>
+                <w:rFonts w:ascii="Arial" w:hAnsi="Arial" w:cs="Arial"/>
+                <w:b/>
+                <w:color w:val="000000"/>
+                <w:sz w:val="14"/>
+                <w:szCs w:val="14"/>
+              </w:rPr>
+              <w:t>{{ antecedentes_registro }}</w:t>
+            </w:r>
+          </w:p>
+        </w:tc>
+      </w:tr>
+      <w:tr>
+        <w:tblPrEx>
+          <w:tblCellMar>
+            <w:left w:w="108" w:type="dxa"/>
+            <w:right w:w="108" w:type="dxa"/>
+          </w:tblCellMar>
+        </w:tblPrEx>
+        <w:trPr>
+          <w:gridAfter w:val="1"/>
+          <w:wAfter w:w="12" w:type="dxa"/>
+        </w:trPr>
+        <w:tc>
+          <w:tcPr>
+            <w:tcW w:w="236" w:type="dxa"/>
+          </w:tcPr>
+          <w:p>
+            <w:pPr>
+              <w:snapToGrid w:val="0"/>
+              <w:rPr>
+                <w:rFonts w:ascii="Arial" w:hAnsi="Arial" w:cs="Arial"/>
+                <w:b/>
+                <w:color w:val="000000"/>
+                <w:sz w:val="16"/>
+                <w:szCs w:val="16"/>
+              </w:rPr>
+            </w:pPr>
+          </w:p>
+        </w:tc>
+        <w:tc>
+          <w:tcPr>
+            <w:tcW w:w="2695" w:type="dxa"/>
+            <w:gridSpan w:val="6"/>
+            <w:tcBorders>
+              <w:top w:val="threeDEngrave" w:sz="12" w:space="0" w:color="E6E6E6"/>
+              <w:left w:val="threeDEngrave" w:sz="12" w:space="0" w:color="E6E6E6"/>
+              <w:bottom w:val="threeDEngrave" w:sz="12" w:space="0" w:color="FFFFFF"/>
+            </w:tcBorders>
+            <w:shd w:val="clear" w:color="auto" w:fill="D9D9D9"/>
+            <w:vAlign w:val="center"/>
+          </w:tcPr>
+          <w:p>
+            <w:pPr>
+              <w:jc w:val="right"/>
+            </w:pPr>
+            <w:r>
+              <w:rPr>
+                <w:rFonts w:ascii="Arial" w:hAnsi="Arial" w:cs="Arial"/>
+                <w:b/>
+                <w:color w:val="000000"/>
+                <w:sz w:val="14"/>
+                <w:szCs w:val="14"/>
+              </w:rPr>
+              <w:t>Destino del inmueble:</w:t>
+            </w:r>
+          </w:p>
+        </w:tc>
+        <w:tc>
+          <w:tcPr>
+            <w:tcW w:w="3432" w:type="dxa"/>
+            <w:gridSpan w:val="18"/>
+            <w:tcBorders>
+              <w:top w:val="threeDEngrave" w:sz="12" w:space="0" w:color="E6E6E6"/>
+              <w:left w:val="threeDEngrave" w:sz="12" w:space="0" w:color="E6E6E6"/>
+              <w:bottom w:val="threeDEngrave" w:sz="12" w:space="0" w:color="FFFFFF"/>
+            </w:tcBorders>
+            <w:vAlign w:val="center"/>
+          </w:tcPr>
+          <w:p>
+            <w:r>
+              <w:rPr>
+                <w:rFonts w:ascii="Arial" w:hAnsi="Arial" w:cs="Arial"/>
+                <w:b/>
+                <w:color w:val="000000"/>
+                <w:sz w:val="14"/>
+                <w:szCs w:val="14"/>
+              </w:rPr>
+              <w:t>Destino exclusivo como casa habitación :</w:t>
+            </w:r>
+          </w:p>
+        </w:tc>
+        <w:bookmarkStart w:id="0" w:name="__Fieldmark__34_310243481"/>
+        <w:tc>
+          <w:tcPr>
+            <w:tcW w:w="508" w:type="dxa"/>
+            <w:gridSpan w:val="4"/>
+            <w:tcBorders>
+              <w:top w:val="threeDEngrave" w:sz="12" w:space="0" w:color="E6E6E6"/>
+              <w:left w:val="threeDEngrave" w:sz="12" w:space="0" w:color="E6E6E6"/>
               <w:bottom w:val="threeDEngrave" w:sz="12" w:space="0" w:color="FFFFFF"/>
             </w:tcBorders>
             <w:vAlign w:val="center"/>
@@ -2244,36 +3204,36 @@
         </w:tc>
         <w:tc>
           <w:tcPr>
-            <w:tcW w:w="897" w:type="dxa"/>
+            <w:tcW w:w="1126" w:type="dxa"/>
+            <w:gridSpan w:val="5"/>
+            <w:tcBorders>
+              <w:top w:val="threeDEngrave" w:sz="12" w:space="0" w:color="E6E6E6"/>
+              <w:left w:val="threeDEngrave" w:sz="12" w:space="0" w:color="E6E6E6"/>
+              <w:bottom w:val="threeDEngrave" w:sz="12" w:space="0" w:color="FFFFFF"/>
+            </w:tcBorders>
+            <w:vAlign w:val="center"/>
+          </w:tcPr>
+          <w:p>
+            <w:r>
+              <w:rPr>
+                <w:rFonts w:ascii="Arial" w:hAnsi="Arial" w:cs="Arial"/>
+                <w:b/>
+                <w:color w:val="000000"/>
+                <w:sz w:val="14"/>
+                <w:szCs w:val="14"/>
+              </w:rPr>
+              <w:t>Otro:</w:t>
+            </w:r>
+          </w:p>
+        </w:tc>
+        <w:bookmarkStart w:id="1" w:name="__Fieldmark__35_310243481"/>
+        <w:tc>
+          <w:tcPr>
+            <w:tcW w:w="454" w:type="dxa"/>
             <w:gridSpan w:val="4"/>
             <w:tcBorders>
-              <w:top w:val="threeDEngrave" w:sz="12" w:space="0" w:color="FFFFFF"/>
-              <w:left w:val="threeDEngrave" w:sz="12" w:space="0" w:color="FFFFFF"/>
-              <w:bottom w:val="threeDEngrave" w:sz="12" w:space="0" w:color="FFFFFF"/>
-            </w:tcBorders>
-            <w:vAlign w:val="center"/>
-          </w:tcPr>
-          <w:p>
-            <w:r>
-              <w:rPr>
-                <w:rFonts w:ascii="Arial" w:hAnsi="Arial" w:cs="Arial"/>
-                <w:b/>
-                <w:color w:val="000000"/>
-                <w:sz w:val="14"/>
-                <w:szCs w:val="14"/>
-              </w:rPr>
-              <w:t>Rústico</w:t>
-            </w:r>
-          </w:p>
-        </w:tc>
-        <w:bookmarkStart w:id="1" w:name="__Fieldmark__28_310243481"/>
-        <w:tc>
-          <w:tcPr>
-            <w:tcW w:w="410" w:type="dxa"/>
-            <w:gridSpan w:val="3"/>
-            <w:tcBorders>
-              <w:top w:val="threeDEngrave" w:sz="12" w:space="0" w:color="FFFFFF"/>
-              <w:left w:val="threeDEngrave" w:sz="12" w:space="0" w:color="FFFFFF"/>
+              <w:top w:val="threeDEngrave" w:sz="12" w:space="0" w:color="E6E6E6"/>
+              <w:left w:val="threeDEngrave" w:sz="12" w:space="0" w:color="E6E6E6"/>
               <w:bottom w:val="threeDEngrave" w:sz="12" w:space="0" w:color="FFFFFF"/>
             </w:tcBorders>
             <w:vAlign w:val="center"/>
@@ -2307,128 +3267,27 @@
         </w:tc>
         <w:tc>
           <w:tcPr>
-            <w:tcW w:w="705" w:type="dxa"/>
-            <w:gridSpan w:val="4"/>
-            <w:tcBorders>
-              <w:top w:val="threeDEngrave" w:sz="12" w:space="0" w:color="FFFFFF"/>
-              <w:left w:val="threeDEngrave" w:sz="12" w:space="0" w:color="FFFFFF"/>
+            <w:tcW w:w="2663" w:type="dxa"/>
+            <w:gridSpan w:val="9"/>
+            <w:tcBorders>
+              <w:top w:val="threeDEngrave" w:sz="12" w:space="0" w:color="E6E6E6"/>
+              <w:left w:val="threeDEngrave" w:sz="12" w:space="0" w:color="E6E6E6"/>
               <w:bottom w:val="threeDEngrave" w:sz="12" w:space="0" w:color="FFFFFF"/>
-            </w:tcBorders>
-            <w:vAlign w:val="center"/>
-          </w:tcPr>
-          <w:p>
-            <w:r>
-              <w:rPr>
-                <w:rFonts w:ascii="Arial" w:hAnsi="Arial" w:cs="Arial"/>
-                <w:b/>
-                <w:color w:val="000000"/>
-                <w:sz w:val="14"/>
-                <w:szCs w:val="14"/>
-              </w:rPr>
-              <w:t>Baldío</w:t>
-            </w:r>
-          </w:p>
-        </w:tc>
-        <w:bookmarkStart w:id="2" w:name="__Fieldmark__29_310243481"/>
-        <w:tc>
-          <w:tcPr>
-            <w:tcW w:w="400" w:type="dxa"/>
-            <w:tcBorders>
-              <w:top w:val="threeDEngrave" w:sz="12" w:space="0" w:color="FFFFFF"/>
-              <w:left w:val="threeDEngrave" w:sz="12" w:space="0" w:color="FFFFFF"/>
-              <w:bottom w:val="threeDEngrave" w:sz="12" w:space="0" w:color="FFFFFF"/>
-            </w:tcBorders>
-            <w:vAlign w:val="center"/>
-          </w:tcPr>
-          <w:p>
-            <w:r>
-              <w:fldChar w:fldCharType="begin">
-                <w:ffData>
-                  <w:name w:val=""/>
-                  <w:enabled/>
-                  <w:calcOnExit w:val="0"/>
-                  <w:checkBox>
-                    <w:sizeAuto/>
-                    <w:default w:val="0"/>
-                    <w:checked w:val="0"/>
-                  </w:checkBox>
-                </w:ffData>
-              </w:fldChar>
-            </w:r>
-            <w:r>
-              <w:instrText xml:space="preserve"> FORMCHECKBOX </w:instrText>
-            </w:r>
-            <w:r>
-              <w:fldChar w:fldCharType="separate"/>
-            </w:r>
-            <w:r>
-              <w:fldChar w:fldCharType="end"/>
-            </w:r>
-            <w:bookmarkEnd w:id="2"/>
-          </w:p>
-        </w:tc>
-        <w:tc>
-          <w:tcPr>
-            <w:tcW w:w="1070" w:type="dxa"/>
-            <w:gridSpan w:val="2"/>
-            <w:tcBorders>
-              <w:top w:val="threeDEngrave" w:sz="12" w:space="0" w:color="FFFFFF"/>
-              <w:left w:val="threeDEngrave" w:sz="12" w:space="0" w:color="FFFFFF"/>
-              <w:bottom w:val="threeDEngrave" w:sz="12" w:space="0" w:color="FFFFFF"/>
-            </w:tcBorders>
-            <w:vAlign w:val="center"/>
-          </w:tcPr>
-          <w:p>
-            <w:r>
-              <w:rPr>
-                <w:rFonts w:ascii="Arial" w:hAnsi="Arial" w:cs="Arial"/>
-                <w:b/>
-                <w:color w:val="000000"/>
-                <w:sz w:val="14"/>
-                <w:szCs w:val="14"/>
-              </w:rPr>
-              <w:t>Construido</w:t>
-            </w:r>
-          </w:p>
-        </w:tc>
-        <w:bookmarkStart w:id="3" w:name="__Fieldmark__30_310243481"/>
-        <w:tc>
-          <w:tcPr>
-            <w:tcW w:w="522" w:type="dxa"/>
-            <w:gridSpan w:val="3"/>
-            <w:tcBorders>
-              <w:top w:val="threeDEngrave" w:sz="12" w:space="0" w:color="FFFFFF"/>
-              <w:left w:val="threeDEngrave" w:sz="12" w:space="0" w:color="FFFFFF"/>
-              <w:bottom w:val="threeDEngrave" w:sz="12" w:space="0" w:color="FFFFFF"/>
-              <w:right w:val="threeDEngrave" w:sz="12" w:space="0" w:color="FFFFFF"/>
-            </w:tcBorders>
-            <w:vAlign w:val="center"/>
-          </w:tcPr>
-          <w:p>
-            <w:r>
-              <w:fldChar w:fldCharType="begin">
-                <w:ffData>
-                  <w:name w:val=""/>
-                  <w:enabled/>
-                  <w:calcOnExit w:val="0"/>
-                  <w:checkBox>
-                    <w:sizeAuto/>
-                    <w:default w:val="0"/>
-                    <w:checked w:val="0"/>
-                  </w:checkBox>
-                </w:ffData>
-              </w:fldChar>
-            </w:r>
-            <w:r>
-              <w:instrText xml:space="preserve"> FORMCHECKBOX </w:instrText>
-            </w:r>
-            <w:r>
-              <w:fldChar w:fldCharType="separate"/>
-            </w:r>
-            <w:r>
-              <w:fldChar w:fldCharType="end"/>
-            </w:r>
-            <w:bookmarkEnd w:id="3"/>
+              <w:right w:val="threeDEngrave" w:sz="12" w:space="0" w:color="E6E6E6"/>
+            </w:tcBorders>
+            <w:vAlign w:val="center"/>
+          </w:tcPr>
+          <w:p>
+            <w:pPr>
+              <w:snapToGrid w:val="0"/>
+              <w:rPr>
+                <w:rFonts w:ascii="Arial" w:hAnsi="Arial" w:cs="Arial"/>
+                <w:b/>
+                <w:color w:val="000000"/>
+                <w:sz w:val="14"/>
+                <w:szCs w:val="14"/>
+              </w:rPr>
+            </w:pPr>
           </w:p>
         </w:tc>
       </w:tr>
@@ -2450,245 +3309,42 @@
           <w:p>
             <w:pPr>
               <w:snapToGrid w:val="0"/>
-            </w:pPr>
-          </w:p>
-        </w:tc>
-        <w:tc>
-          <w:tcPr>
-            <w:tcW w:w="2695" w:type="dxa"/>
-            <w:gridSpan w:val="6"/>
-            <w:tcBorders>
-              <w:top w:val="threeDEngrave" w:sz="12" w:space="0" w:color="FFFFFF"/>
-              <w:left w:val="threeDEngrave" w:sz="12" w:space="0" w:color="FFFFFF"/>
-              <w:bottom w:val="threeDEngrave" w:sz="12" w:space="0" w:color="FFFFFF"/>
-            </w:tcBorders>
-            <w:shd w:val="clear" w:color="auto" w:fill="D9D9D9"/>
-            <w:vAlign w:val="center"/>
-          </w:tcPr>
-          <w:p>
-            <w:r>
-              <w:rPr>
-                <w:rFonts w:ascii="Arial" w:hAnsi="Arial" w:cs="Arial"/>
-                <w:b/>
-                <w:color w:val="000000"/>
-                <w:sz w:val="14"/>
-                <w:szCs w:val="14"/>
-              </w:rPr>
-              <w:t>Lo transmitido constituye :</w:t>
-            </w:r>
-          </w:p>
-        </w:tc>
-        <w:tc>
-          <w:tcPr>
-            <w:tcW w:w="937" w:type="dxa"/>
-            <w:gridSpan w:val="6"/>
-            <w:tcBorders>
-              <w:top w:val="threeDEngrave" w:sz="12" w:space="0" w:color="FFFFFF"/>
-              <w:left w:val="threeDEngrave" w:sz="12" w:space="0" w:color="FFFFFF"/>
-              <w:bottom w:val="threeDEngrave" w:sz="12" w:space="0" w:color="FFFFFF"/>
-            </w:tcBorders>
-            <w:vAlign w:val="center"/>
-          </w:tcPr>
-          <w:p>
-            <w:r>
-              <w:rPr>
-                <w:rFonts w:ascii="Arial" w:hAnsi="Arial" w:cs="Arial"/>
-                <w:b/>
-                <w:color w:val="000000"/>
-                <w:sz w:val="14"/>
-                <w:szCs w:val="14"/>
-              </w:rPr>
-              <w:t>Fracción:</w:t>
-            </w:r>
-          </w:p>
-        </w:tc>
-        <w:bookmarkStart w:id="4" w:name="__Fieldmark__31_310243481"/>
-        <w:tc>
-          <w:tcPr>
-            <w:tcW w:w="401" w:type="dxa"/>
-            <w:gridSpan w:val="3"/>
-            <w:tcBorders>
-              <w:top w:val="threeDEngrave" w:sz="12" w:space="0" w:color="FFFFFF"/>
-              <w:left w:val="threeDEngrave" w:sz="12" w:space="0" w:color="FFFFFF"/>
-              <w:bottom w:val="threeDEngrave" w:sz="12" w:space="0" w:color="FFFFFF"/>
-            </w:tcBorders>
-            <w:vAlign w:val="center"/>
-          </w:tcPr>
-          <w:p>
-            <w:r>
-              <w:fldChar w:fldCharType="begin">
-                <w:ffData>
-                  <w:name w:val=""/>
-                  <w:enabled/>
-                  <w:calcOnExit w:val="0"/>
-                  <w:checkBox>
-                    <w:sizeAuto/>
-                    <w:default w:val="0"/>
-                    <w:checked w:val="0"/>
-                  </w:checkBox>
-                </w:ffData>
-              </w:fldChar>
-            </w:r>
-            <w:r>
-              <w:instrText xml:space="preserve"> FORMCHECKBOX </w:instrText>
-            </w:r>
-            <w:r>
-              <w:fldChar w:fldCharType="separate"/>
-            </w:r>
-            <w:r>
-              <w:fldChar w:fldCharType="end"/>
-            </w:r>
-            <w:bookmarkEnd w:id="4"/>
-          </w:p>
-        </w:tc>
-        <w:tc>
-          <w:tcPr>
-            <w:tcW w:w="755" w:type="dxa"/>
-            <w:gridSpan w:val="2"/>
-            <w:tcBorders>
-              <w:top w:val="threeDEngrave" w:sz="12" w:space="0" w:color="FFFFFF"/>
-              <w:left w:val="threeDEngrave" w:sz="12" w:space="0" w:color="FFFFFF"/>
-              <w:bottom w:val="threeDEngrave" w:sz="12" w:space="0" w:color="FFFFFF"/>
-            </w:tcBorders>
-            <w:vAlign w:val="center"/>
-          </w:tcPr>
-          <w:p>
-            <w:r>
-              <w:rPr>
-                <w:rFonts w:ascii="Arial" w:hAnsi="Arial" w:cs="Arial"/>
-                <w:b/>
-                <w:color w:val="000000"/>
-                <w:sz w:val="14"/>
-                <w:szCs w:val="14"/>
-              </w:rPr>
-              <w:t>Resto:</w:t>
-            </w:r>
-          </w:p>
-        </w:tc>
-        <w:bookmarkStart w:id="5" w:name="__Fieldmark__32_310243481"/>
-        <w:tc>
-          <w:tcPr>
-            <w:tcW w:w="450" w:type="dxa"/>
-            <w:gridSpan w:val="3"/>
-            <w:tcBorders>
-              <w:top w:val="threeDEngrave" w:sz="12" w:space="0" w:color="FFFFFF"/>
-              <w:left w:val="threeDEngrave" w:sz="12" w:space="0" w:color="FFFFFF"/>
-              <w:bottom w:val="threeDEngrave" w:sz="12" w:space="0" w:color="FFFFFF"/>
-            </w:tcBorders>
-            <w:vAlign w:val="center"/>
-          </w:tcPr>
-          <w:p>
-            <w:r>
-              <w:fldChar w:fldCharType="begin">
-                <w:ffData>
-                  <w:name w:val=""/>
-                  <w:enabled/>
-                  <w:calcOnExit w:val="0"/>
-                  <w:checkBox>
-                    <w:sizeAuto/>
-                    <w:default w:val="0"/>
-                    <w:checked w:val="0"/>
-                  </w:checkBox>
-                </w:ffData>
-              </w:fldChar>
-            </w:r>
-            <w:r>
-              <w:instrText xml:space="preserve"> FORMCHECKBOX </w:instrText>
-            </w:r>
-            <w:r>
-              <w:fldChar w:fldCharType="separate"/>
-            </w:r>
-            <w:r>
-              <w:fldChar w:fldCharType="end"/>
-            </w:r>
-            <w:bookmarkEnd w:id="5"/>
-          </w:p>
-        </w:tc>
-        <w:tc>
-          <w:tcPr>
-            <w:tcW w:w="990" w:type="dxa"/>
-            <w:gridSpan w:val="5"/>
-            <w:tcBorders>
-              <w:top w:val="threeDEngrave" w:sz="12" w:space="0" w:color="FFFFFF"/>
-              <w:left w:val="threeDEngrave" w:sz="12" w:space="0" w:color="FFFFFF"/>
-              <w:bottom w:val="threeDEngrave" w:sz="12" w:space="0" w:color="FFFFFF"/>
-            </w:tcBorders>
-            <w:vAlign w:val="center"/>
-          </w:tcPr>
-          <w:p>
-            <w:r>
-              <w:rPr>
-                <w:rFonts w:ascii="Arial" w:hAnsi="Arial" w:cs="Arial"/>
-                <w:b/>
-                <w:color w:val="000000"/>
-                <w:sz w:val="14"/>
-                <w:szCs w:val="14"/>
-              </w:rPr>
-              <w:t>Totalidad:</w:t>
-            </w:r>
-          </w:p>
-        </w:tc>
-        <w:bookmarkStart w:id="6" w:name="__Fieldmark__33_310243481"/>
-        <w:tc>
-          <w:tcPr>
-            <w:tcW w:w="450" w:type="dxa"/>
-            <w:gridSpan w:val="4"/>
-            <w:tcBorders>
-              <w:top w:val="threeDEngrave" w:sz="12" w:space="0" w:color="FFFFFF"/>
-              <w:left w:val="threeDEngrave" w:sz="12" w:space="0" w:color="FFFFFF"/>
-              <w:bottom w:val="threeDEngrave" w:sz="12" w:space="0" w:color="FFFFFF"/>
-            </w:tcBorders>
-            <w:vAlign w:val="center"/>
-          </w:tcPr>
-          <w:p>
-            <w:r>
-              <w:fldChar w:fldCharType="begin">
-                <w:ffData>
-                  <w:name w:val=""/>
-                  <w:enabled/>
-                  <w:calcOnExit w:val="0"/>
-                  <w:checkBox>
-                    <w:sizeAuto/>
-                    <w:default w:val="0"/>
-                    <w:checked w:val="0"/>
-                  </w:checkBox>
-                </w:ffData>
-              </w:fldChar>
-            </w:r>
-            <w:r>
-              <w:instrText xml:space="preserve"> FORMCHECKBOX </w:instrText>
-            </w:r>
-            <w:r>
-              <w:fldChar w:fldCharType="separate"/>
-            </w:r>
-            <w:r>
-              <w:fldChar w:fldCharType="end"/>
-            </w:r>
-            <w:bookmarkEnd w:id="6"/>
-          </w:p>
-        </w:tc>
-        <w:tc>
-          <w:tcPr>
-            <w:tcW w:w="4200" w:type="dxa"/>
-            <w:gridSpan w:val="18"/>
-            <w:tcBorders>
-              <w:top w:val="threeDEngrave" w:sz="12" w:space="0" w:color="FFFFFF"/>
-              <w:left w:val="threeDEngrave" w:sz="12" w:space="0" w:color="FFFFFF"/>
-              <w:bottom w:val="threeDEngrave" w:sz="12" w:space="0" w:color="FFFFFF"/>
-              <w:right w:val="threeDEngrave" w:sz="12" w:space="0" w:color="FFFFFF"/>
-            </w:tcBorders>
-            <w:vAlign w:val="center"/>
-          </w:tcPr>
-          <w:p>
-            <w:r>
-              <w:rPr>
-                <w:rFonts w:ascii="Arial" w:hAnsi="Arial" w:cs="Arial"/>
-                <w:b/>
-                <w:color w:val="000000"/>
-                <w:sz w:val="14"/>
-                <w:szCs w:val="14"/>
-              </w:rPr>
-              <w:t>en relación con el título inmediato anterior.</w:t>
+              <w:rPr>
+                <w:rFonts w:ascii="Arial" w:hAnsi="Arial" w:cs="Arial"/>
+                <w:b/>
+                <w:color w:val="000000"/>
+                <w:sz w:val="16"/>
+                <w:szCs w:val="16"/>
+              </w:rPr>
+            </w:pPr>
+          </w:p>
+        </w:tc>
+        <w:tc>
+          <w:tcPr>
+            <w:tcW w:w="10878" w:type="dxa"/>
+            <w:gridSpan w:val="46"/>
+            <w:tcBorders>
+              <w:top w:val="threeDEngrave" w:sz="12" w:space="0" w:color="E6E6E6"/>
+              <w:left w:val="threeDEngrave" w:sz="12" w:space="0" w:color="E6E6E6"/>
+              <w:bottom w:val="threeDEngrave" w:sz="12" w:space="0" w:color="E6E6E6"/>
+              <w:right w:val="threeDEngrave" w:sz="12" w:space="0" w:color="E6E6E6"/>
+            </w:tcBorders>
+            <w:shd w:val="clear" w:color="auto" w:fill="A6A6A6"/>
+            <w:vAlign w:val="center"/>
+          </w:tcPr>
+          <w:p>
+            <w:pPr>
+              <w:jc w:val="center"/>
+            </w:pPr>
+            <w:r>
+              <w:rPr>
+                <w:rFonts w:ascii="Arial" w:hAnsi="Arial" w:cs="Arial"/>
+                <w:b/>
+                <w:color w:val="FFFFFF"/>
+                <w:sz w:val="18"/>
+                <w:szCs w:val="18"/>
+              </w:rPr>
+              <w:t>VALORES</w:t>
             </w:r>
           </w:p>
         </w:tc>
@@ -2716,27 +3372,86 @@
         </w:tc>
         <w:tc>
           <w:tcPr>
-            <w:tcW w:w="10878" w:type="dxa"/>
-            <w:gridSpan w:val="47"/>
+            <w:tcW w:w="3596" w:type="dxa"/>
+            <w:gridSpan w:val="11"/>
             <w:tcBorders>
               <w:top w:val="threeDEngrave" w:sz="12" w:space="0" w:color="E6E6E6"/>
               <w:left w:val="threeDEngrave" w:sz="12" w:space="0" w:color="E6E6E6"/>
               <w:bottom w:val="threeDEngrave" w:sz="12" w:space="0" w:color="E6E6E6"/>
+            </w:tcBorders>
+            <w:shd w:val="clear" w:color="auto" w:fill="D9D9D9"/>
+            <w:vAlign w:val="center"/>
+          </w:tcPr>
+          <w:p>
+            <w:pPr>
+              <w:jc w:val="center"/>
+            </w:pPr>
+            <w:r>
+              <w:rPr>
+                <w:rFonts w:ascii="Arial" w:hAnsi="Arial" w:cs="Arial"/>
+                <w:b/>
+                <w:color w:val="000000"/>
+                <w:sz w:val="14"/>
+                <w:szCs w:val="14"/>
+              </w:rPr>
+              <w:t>Catastral</w:t>
+            </w:r>
+          </w:p>
+        </w:tc>
+        <w:tc>
+          <w:tcPr>
+            <w:tcW w:w="3596" w:type="dxa"/>
+            <w:gridSpan w:val="20"/>
+            <w:tcBorders>
+              <w:top w:val="threeDEngrave" w:sz="12" w:space="0" w:color="E6E6E6"/>
+              <w:left w:val="threeDEngrave" w:sz="12" w:space="0" w:color="E6E6E6"/>
+              <w:bottom w:val="threeDEngrave" w:sz="12" w:space="0" w:color="E6E6E6"/>
+            </w:tcBorders>
+            <w:shd w:val="clear" w:color="auto" w:fill="D9D9D9"/>
+            <w:vAlign w:val="center"/>
+          </w:tcPr>
+          <w:p>
+            <w:pPr>
+              <w:jc w:val="center"/>
+            </w:pPr>
+            <w:r>
+              <w:rPr>
+                <w:rFonts w:ascii="Arial" w:hAnsi="Arial" w:cs="Arial"/>
+                <w:b/>
+                <w:color w:val="000000"/>
+                <w:sz w:val="14"/>
+                <w:szCs w:val="14"/>
+              </w:rPr>
+              <w:t>De operación</w:t>
+            </w:r>
+          </w:p>
+        </w:tc>
+        <w:tc>
+          <w:tcPr>
+            <w:tcW w:w="3686" w:type="dxa"/>
+            <w:gridSpan w:val="15"/>
+            <w:tcBorders>
+              <w:top w:val="threeDEngrave" w:sz="12" w:space="0" w:color="E6E6E6"/>
+              <w:left w:val="threeDEngrave" w:sz="12" w:space="0" w:color="E6E6E6"/>
+              <w:bottom w:val="threeDEngrave" w:sz="12" w:space="0" w:color="E6E6E6"/>
               <w:right w:val="threeDEngrave" w:sz="12" w:space="0" w:color="E6E6E6"/>
             </w:tcBorders>
             <w:shd w:val="clear" w:color="auto" w:fill="D9D9D9"/>
             <w:vAlign w:val="center"/>
           </w:tcPr>
           <w:p>
-            <w:r>
-              <w:rPr>
-                <w:rFonts w:ascii="Arial" w:hAnsi="Arial" w:cs="Arial"/>
-                <w:b/>
-                <w:color w:val="000000"/>
-                <w:sz w:val="14"/>
-                <w:szCs w:val="14"/>
-              </w:rPr>
-              <w:t>Ubicación, medidas y linderos:</w:t>
+            <w:pPr>
+              <w:jc w:val="center"/>
+            </w:pPr>
+            <w:r>
+              <w:rPr>
+                <w:rFonts w:ascii="Arial" w:hAnsi="Arial" w:cs="Arial"/>
+                <w:b/>
+                <w:color w:val="000000"/>
+                <w:sz w:val="14"/>
+                <w:szCs w:val="14"/>
+              </w:rPr>
+              <w:t>De avalúo</w:t>
             </w:r>
           </w:p>
         </w:tc>
@@ -2764,12 +3479,82 @@
         </w:tc>
         <w:tc>
           <w:tcPr>
-            <w:tcW w:w="10878" w:type="dxa"/>
-            <w:gridSpan w:val="47"/>
+            <w:tcW w:w="3596" w:type="dxa"/>
+            <w:gridSpan w:val="11"/>
             <w:tcBorders>
               <w:top w:val="threeDEngrave" w:sz="12" w:space="0" w:color="E6E6E6"/>
               <w:left w:val="threeDEngrave" w:sz="12" w:space="0" w:color="E6E6E6"/>
               <w:bottom w:val="threeDEngrave" w:sz="12" w:space="0" w:color="E6E6E6"/>
+            </w:tcBorders>
+            <w:vAlign w:val="center"/>
+          </w:tcPr>
+          <w:p>
+            <w:pPr>
+              <w:snapToGrid w:val="0"/>
+              <w:jc w:val="center"/>
+              <w:rPr>
+                <w:rFonts w:ascii="Arial" w:hAnsi="Arial" w:cs="Arial"/>
+                <w:b/>
+                <w:color w:val="000000"/>
+                <w:sz w:val="14"/>
+                <w:szCs w:val="14"/>
+              </w:rPr>
+            </w:pPr>
+            <w:r>
+              <w:rPr>
+                <w:rFonts w:ascii="Arial" w:hAnsi="Arial" w:cs="Arial"/>
+                <w:b/>
+                <w:color w:val="000000"/>
+                <w:sz w:val="14"/>
+                <w:szCs w:val="14"/>
+              </w:rPr>
+              <w:t>{{ valor_catastral }}</w:t>
+            </w:r>
+          </w:p>
+        </w:tc>
+        <w:tc>
+          <w:tcPr>
+            <w:tcW w:w="3596" w:type="dxa"/>
+            <w:gridSpan w:val="20"/>
+            <w:tcBorders>
+              <w:top w:val="threeDEngrave" w:sz="12" w:space="0" w:color="E6E6E6"/>
+              <w:left w:val="threeDEngrave" w:sz="12" w:space="0" w:color="E6E6E6"/>
+              <w:bottom w:val="threeDEngrave" w:sz="12" w:space="0" w:color="E6E6E6"/>
+            </w:tcBorders>
+            <w:vAlign w:val="center"/>
+          </w:tcPr>
+          <w:p>
+            <w:pPr>
+              <w:snapToGrid w:val="0"/>
+              <w:jc w:val="center"/>
+              <w:rPr>
+                <w:rFonts w:ascii="Arial" w:hAnsi="Arial" w:cs="Arial"/>
+                <w:b/>
+                <w:color w:val="000000"/>
+                <w:sz w:val="14"/>
+                <w:szCs w:val="14"/>
+              </w:rPr>
+            </w:pPr>
+            <w:r>
+              <w:rPr>
+                <w:rFonts w:ascii="Arial" w:hAnsi="Arial" w:cs="Arial"/>
+                <w:b/>
+                <w:color w:val="000000"/>
+                <w:sz w:val="14"/>
+                <w:szCs w:val="14"/>
+              </w:rPr>
+              <w:t>{{ valor_operacion }}</w:t>
+            </w:r>
+          </w:p>
+        </w:tc>
+        <w:tc>
+          <w:tcPr>
+            <w:tcW w:w="3686" w:type="dxa"/>
+            <w:gridSpan w:val="15"/>
+            <w:tcBorders>
+              <w:top w:val="threeDEngrave" w:sz="12" w:space="0" w:color="E6E6E6"/>
+              <w:left w:val="threeDEngrave" w:sz="12" w:space="0" w:color="E6E6E6"/>
+              <w:bottom w:val="threeDEngrave" w:sz="12" w:space="0" w:color="E6E6E6"/>
               <w:right w:val="threeDEngrave" w:sz="12" w:space="0" w:color="E6E6E6"/>
             </w:tcBorders>
             <w:vAlign w:val="center"/>
@@ -2793,7 +3578,7 @@
                 <w:sz w:val="14"/>
                 <w:szCs w:val="14"/>
               </w:rPr>
-              <w:t>{{ ubicacion_inmueble }}</w:t>
+              <w:t>{{ valor_avaluo }}</w:t>
             </w:r>
           </w:p>
         </w:tc>
@@ -2828,28 +3613,53 @@
         </w:tc>
         <w:tc>
           <w:tcPr>
-            <w:tcW w:w="10878" w:type="dxa"/>
-            <w:gridSpan w:val="47"/>
-            <w:tcBorders>
-              <w:top w:val="threeDEngrave" w:sz="12" w:space="0" w:color="E6E6E6"/>
+            <w:tcW w:w="7192" w:type="dxa"/>
+            <w:gridSpan w:val="31"/>
+            <w:tcBorders>
+              <w:left w:val="threeDEngrave" w:sz="12" w:space="0" w:color="E6E6E6"/>
+              <w:bottom w:val="threeDEngrave" w:sz="12" w:space="0" w:color="E6E6E6"/>
+            </w:tcBorders>
+            <w:vAlign w:val="center"/>
+          </w:tcPr>
+          <w:p>
+            <w:pPr>
+              <w:snapToGrid w:val="0"/>
+              <w:jc w:val="right"/>
+            </w:pPr>
+            <w:r>
+              <w:rPr>
+                <w:rFonts w:ascii="Arial" w:hAnsi="Arial" w:cs="Arial"/>
+                <w:b/>
+                <w:color w:val="000000"/>
+                <w:sz w:val="14"/>
+                <w:szCs w:val="14"/>
+              </w:rPr>
+              <w:t>Porcentaje total transmitido:</w:t>
+            </w:r>
+          </w:p>
+        </w:tc>
+        <w:tc>
+          <w:tcPr>
+            <w:tcW w:w="3686" w:type="dxa"/>
+            <w:gridSpan w:val="15"/>
+            <w:tcBorders>
               <w:left w:val="threeDEngrave" w:sz="12" w:space="0" w:color="E6E6E6"/>
               <w:bottom w:val="threeDEngrave" w:sz="12" w:space="0" w:color="E6E6E6"/>
               <w:right w:val="threeDEngrave" w:sz="12" w:space="0" w:color="E6E6E6"/>
             </w:tcBorders>
-            <w:shd w:val="clear" w:color="auto" w:fill="D9D9D9"/>
-            <w:vAlign w:val="center"/>
-          </w:tcPr>
-          <w:p>
-            <w:r>
-              <w:rPr>
-                <w:rFonts w:ascii="Arial" w:hAnsi="Arial" w:cs="Arial"/>
-                <w:b/>
-                <w:color w:val="000000"/>
-                <w:sz w:val="14"/>
-                <w:szCs w:val="14"/>
-              </w:rPr>
-              <w:t>Procedencia o antecedentes de la adquisición (incluir Datos de Registro Público de la Propiedad en caso de no contar con Folio Real):</w:t>
-            </w:r>
+            <w:vAlign w:val="center"/>
+          </w:tcPr>
+          <w:p>
+            <w:pPr>
+              <w:snapToGrid w:val="0"/>
+              <w:jc w:val="center"/>
+              <w:rPr>
+                <w:rFonts w:ascii="Arial" w:hAnsi="Arial" w:cs="Arial"/>
+                <w:color w:val="000000"/>
+                <w:sz w:val="14"/>
+                <w:szCs w:val="14"/>
+              </w:rPr>
+            </w:pPr>
           </w:p>
         </w:tc>
       </w:tr>
@@ -2871,15 +3681,47 @@
           <w:p>
             <w:pPr>
               <w:snapToGrid w:val="0"/>
-            </w:pPr>
-          </w:p>
-        </w:tc>
-        <w:tc>
-          <w:tcPr>
-            <w:tcW w:w="10878" w:type="dxa"/>
-            <w:gridSpan w:val="47"/>
-            <w:tcBorders>
-              <w:top w:val="threeDEngrave" w:sz="12" w:space="0" w:color="E6E6E6"/>
+              <w:rPr>
+                <w:rFonts w:ascii="Arial" w:hAnsi="Arial" w:cs="Arial"/>
+                <w:color w:val="000000"/>
+                <w:sz w:val="16"/>
+                <w:szCs w:val="16"/>
+              </w:rPr>
+            </w:pPr>
+          </w:p>
+        </w:tc>
+        <w:tc>
+          <w:tcPr>
+            <w:tcW w:w="7192" w:type="dxa"/>
+            <w:gridSpan w:val="31"/>
+            <w:tcBorders>
+              <w:left w:val="threeDEngrave" w:sz="12" w:space="0" w:color="E6E6E6"/>
+              <w:bottom w:val="threeDEngrave" w:sz="12" w:space="0" w:color="E6E6E6"/>
+            </w:tcBorders>
+            <w:vAlign w:val="center"/>
+          </w:tcPr>
+          <w:p>
+            <w:pPr>
+              <w:snapToGrid w:val="0"/>
+              <w:jc w:val="right"/>
+            </w:pPr>
+            <w:r>
+              <w:rPr>
+                <w:rFonts w:ascii="Arial" w:hAnsi="Arial" w:cs="Arial"/>
+                <w:b/>
+                <w:color w:val="000000"/>
+                <w:sz w:val="14"/>
+                <w:szCs w:val="14"/>
+              </w:rPr>
+              <w:t>Base para cálculo del impuesto (después de aplicar beneficios según ley):</w:t>
+            </w:r>
+          </w:p>
+        </w:tc>
+        <w:tc>
+          <w:tcPr>
+            <w:tcW w:w="3686" w:type="dxa"/>
+            <w:gridSpan w:val="15"/>
+            <w:tcBorders>
               <w:left w:val="threeDEngrave" w:sz="12" w:space="0" w:color="E6E6E6"/>
               <w:bottom w:val="threeDEngrave" w:sz="12" w:space="0" w:color="E6E6E6"/>
               <w:right w:val="threeDEngrave" w:sz="12" w:space="0" w:color="E6E6E6"/>
@@ -2889,24 +3731,14 @@
           <w:p>
             <w:pPr>
               <w:snapToGrid w:val="0"/>
-              <w:rPr>
-                <w:rFonts w:ascii="Arial" w:hAnsi="Arial" w:cs="Arial"/>
-                <w:b/>
-                <w:color w:val="000000"/>
-                <w:sz w:val="14"/>
-                <w:szCs w:val="14"/>
-              </w:rPr>
-            </w:pPr>
-            <w:r>
-              <w:rPr>
-                <w:rFonts w:ascii="Arial" w:hAnsi="Arial" w:cs="Arial"/>
-                <w:b/>
-                <w:color w:val="000000"/>
-                <w:sz w:val="14"/>
-                <w:szCs w:val="14"/>
-              </w:rPr>
-              <w:t>{{ antecedentes_registro }}</w:t>
-            </w:r>
+              <w:jc w:val="center"/>
+              <w:rPr>
+                <w:rFonts w:ascii="Arial" w:hAnsi="Arial" w:cs="Arial"/>
+                <w:color w:val="000000"/>
+                <w:sz w:val="14"/>
+                <w:szCs w:val="14"/>
+              </w:rPr>
+            </w:pPr>
           </w:p>
         </w:tc>
       </w:tr>
@@ -2930,7 +3762,6 @@
               <w:snapToGrid w:val="0"/>
               <w:rPr>
                 <w:rFonts w:ascii="Arial" w:hAnsi="Arial" w:cs="Arial"/>
-                <w:b/>
                 <w:color w:val="000000"/>
                 <w:sz w:val="16"/>
                 <w:szCs w:val="16"/>
@@ -2940,181 +3771,31 @@
         </w:tc>
         <w:tc>
           <w:tcPr>
-            <w:tcW w:w="2695" w:type="dxa"/>
-            <w:gridSpan w:val="6"/>
-            <w:tcBorders>
-              <w:top w:val="threeDEngrave" w:sz="12" w:space="0" w:color="E6E6E6"/>
-              <w:left w:val="threeDEngrave" w:sz="12" w:space="0" w:color="E6E6E6"/>
-              <w:bottom w:val="threeDEngrave" w:sz="12" w:space="0" w:color="FFFFFF"/>
-            </w:tcBorders>
-            <w:shd w:val="clear" w:color="auto" w:fill="D9D9D9"/>
-            <w:vAlign w:val="center"/>
-          </w:tcPr>
-          <w:p>
-            <w:pPr>
-              <w:jc w:val="right"/>
-            </w:pPr>
-            <w:r>
-              <w:rPr>
-                <w:rFonts w:ascii="Arial" w:hAnsi="Arial" w:cs="Arial"/>
-                <w:b/>
-                <w:color w:val="000000"/>
-                <w:sz w:val="14"/>
-                <w:szCs w:val="14"/>
-              </w:rPr>
-              <w:t>Destino del inmueble:</w:t>
-            </w:r>
-          </w:p>
-        </w:tc>
-        <w:tc>
-          <w:tcPr>
-            <w:tcW w:w="3432" w:type="dxa"/>
-            <w:gridSpan w:val="18"/>
-            <w:tcBorders>
-              <w:top w:val="threeDEngrave" w:sz="12" w:space="0" w:color="E6E6E6"/>
-              <w:left w:val="threeDEngrave" w:sz="12" w:space="0" w:color="E6E6E6"/>
-              <w:bottom w:val="threeDEngrave" w:sz="12" w:space="0" w:color="FFFFFF"/>
-            </w:tcBorders>
-            <w:vAlign w:val="center"/>
-          </w:tcPr>
-          <w:p>
-            <w:r>
-              <w:rPr>
-                <w:rFonts w:ascii="Arial" w:hAnsi="Arial" w:cs="Arial"/>
-                <w:b/>
-                <w:color w:val="000000"/>
-                <w:sz w:val="14"/>
-                <w:szCs w:val="14"/>
-              </w:rPr>
-              <w:t>Destino exclusivo como casa habitación :</w:t>
-            </w:r>
-          </w:p>
-        </w:tc>
-        <w:bookmarkStart w:id="7" w:name="__Fieldmark__34_310243481"/>
-        <w:tc>
-          <w:tcPr>
-            <w:tcW w:w="508" w:type="dxa"/>
-            <w:gridSpan w:val="4"/>
-            <w:tcBorders>
-              <w:top w:val="threeDEngrave" w:sz="12" w:space="0" w:color="E6E6E6"/>
-              <w:left w:val="threeDEngrave" w:sz="12" w:space="0" w:color="E6E6E6"/>
-              <w:bottom w:val="threeDEngrave" w:sz="12" w:space="0" w:color="FFFFFF"/>
-            </w:tcBorders>
-            <w:vAlign w:val="center"/>
-          </w:tcPr>
-          <w:p>
-            <w:r>
-              <w:fldChar w:fldCharType="begin">
-                <w:ffData>
-                  <w:name w:val=""/>
-                  <w:enabled/>
-                  <w:calcOnExit w:val="0"/>
-                  <w:checkBox>
-                    <w:sizeAuto/>
-                    <w:default w:val="0"/>
-                    <w:checked w:val="0"/>
-                  </w:checkBox>
-                </w:ffData>
-              </w:fldChar>
-            </w:r>
-            <w:r>
-              <w:instrText xml:space="preserve"> FORMCHECKBOX </w:instrText>
-            </w:r>
-            <w:r>
-              <w:fldChar w:fldCharType="separate"/>
-            </w:r>
-            <w:r>
-              <w:fldChar w:fldCharType="end"/>
-            </w:r>
-            <w:bookmarkEnd w:id="7"/>
-          </w:p>
-        </w:tc>
-        <w:tc>
-          <w:tcPr>
-            <w:tcW w:w="1130" w:type="dxa"/>
-            <w:gridSpan w:val="5"/>
-            <w:tcBorders>
-              <w:top w:val="threeDEngrave" w:sz="12" w:space="0" w:color="E6E6E6"/>
-              <w:left w:val="threeDEngrave" w:sz="12" w:space="0" w:color="E6E6E6"/>
-              <w:bottom w:val="threeDEngrave" w:sz="12" w:space="0" w:color="FFFFFF"/>
-            </w:tcBorders>
-            <w:vAlign w:val="center"/>
-          </w:tcPr>
-          <w:p>
-            <w:r>
-              <w:rPr>
-                <w:rFonts w:ascii="Arial" w:hAnsi="Arial" w:cs="Arial"/>
-                <w:b/>
-                <w:color w:val="000000"/>
-                <w:sz w:val="14"/>
-                <w:szCs w:val="14"/>
-              </w:rPr>
-              <w:t>Otro:</w:t>
-            </w:r>
-          </w:p>
-        </w:tc>
-        <w:bookmarkStart w:id="8" w:name="__Fieldmark__35_310243481"/>
-        <w:tc>
-          <w:tcPr>
-            <w:tcW w:w="450" w:type="dxa"/>
-            <w:gridSpan w:val="5"/>
-            <w:tcBorders>
-              <w:top w:val="threeDEngrave" w:sz="12" w:space="0" w:color="E6E6E6"/>
-              <w:left w:val="threeDEngrave" w:sz="12" w:space="0" w:color="E6E6E6"/>
-              <w:bottom w:val="threeDEngrave" w:sz="12" w:space="0" w:color="FFFFFF"/>
-            </w:tcBorders>
-            <w:vAlign w:val="center"/>
-          </w:tcPr>
-          <w:p>
-            <w:r>
-              <w:fldChar w:fldCharType="begin">
-                <w:ffData>
-                  <w:name w:val=""/>
-                  <w:enabled/>
-                  <w:calcOnExit w:val="0"/>
-                  <w:checkBox>
-                    <w:sizeAuto/>
-                    <w:default w:val="0"/>
-                    <w:checked w:val="0"/>
-                  </w:checkBox>
-                </w:ffData>
-              </w:fldChar>
-            </w:r>
-            <w:r>
-              <w:instrText xml:space="preserve"> FORMCHECKBOX </w:instrText>
-            </w:r>
-            <w:r>
-              <w:fldChar w:fldCharType="separate"/>
-            </w:r>
-            <w:r>
-              <w:fldChar w:fldCharType="end"/>
-            </w:r>
-            <w:bookmarkEnd w:id="8"/>
-          </w:p>
-        </w:tc>
-        <w:tc>
-          <w:tcPr>
-            <w:tcW w:w="2663" w:type="dxa"/>
-            <w:gridSpan w:val="9"/>
-            <w:tcBorders>
-              <w:top w:val="threeDEngrave" w:sz="12" w:space="0" w:color="E6E6E6"/>
-              <w:left w:val="threeDEngrave" w:sz="12" w:space="0" w:color="E6E6E6"/>
-              <w:bottom w:val="threeDEngrave" w:sz="12" w:space="0" w:color="FFFFFF"/>
+            <w:tcW w:w="10878" w:type="dxa"/>
+            <w:gridSpan w:val="46"/>
+            <w:tcBorders>
+              <w:left w:val="threeDEngrave" w:sz="12" w:space="0" w:color="E6E6E6"/>
+              <w:bottom w:val="threeDEngrave" w:sz="12" w:space="0" w:color="E6E6E6"/>
               <w:right w:val="threeDEngrave" w:sz="12" w:space="0" w:color="E6E6E6"/>
             </w:tcBorders>
-            <w:vAlign w:val="center"/>
-          </w:tcPr>
-          <w:p>
-            <w:pPr>
-              <w:snapToGrid w:val="0"/>
-              <w:rPr>
-                <w:rFonts w:ascii="Arial" w:hAnsi="Arial" w:cs="Arial"/>
-                <w:b/>
-                <w:color w:val="000000"/>
-                <w:sz w:val="14"/>
-                <w:szCs w:val="14"/>
-              </w:rPr>
-            </w:pPr>
+            <w:shd w:val="clear" w:color="auto" w:fill="999999"/>
+            <w:vAlign w:val="center"/>
+          </w:tcPr>
+          <w:p>
+            <w:pPr>
+              <w:snapToGrid w:val="0"/>
+              <w:jc w:val="center"/>
+            </w:pPr>
+            <w:r>
+              <w:rPr>
+                <w:rFonts w:ascii="Arial" w:hAnsi="Arial" w:cs="Arial"/>
+                <w:b/>
+                <w:color w:val="FFFFFF"/>
+                <w:sz w:val="18"/>
+                <w:szCs w:val="18"/>
+              </w:rPr>
+              <w:t>TABULADOR SEGÚN LEY DE INGRESOS</w:t>
+            </w:r>
           </w:p>
         </w:tc>
       </w:tr>
@@ -3136,42 +3817,91 @@
           <w:p>
             <w:pPr>
               <w:snapToGrid w:val="0"/>
-              <w:rPr>
-                <w:rFonts w:ascii="Arial" w:hAnsi="Arial" w:cs="Arial"/>
-                <w:b/>
-                <w:color w:val="000000"/>
-                <w:sz w:val="16"/>
-                <w:szCs w:val="16"/>
-              </w:rPr>
-            </w:pPr>
-          </w:p>
-        </w:tc>
-        <w:tc>
-          <w:tcPr>
-            <w:tcW w:w="10878" w:type="dxa"/>
-            <w:gridSpan w:val="47"/>
-            <w:tcBorders>
-              <w:top w:val="threeDEngrave" w:sz="12" w:space="0" w:color="E6E6E6"/>
+            </w:pPr>
+          </w:p>
+        </w:tc>
+        <w:tc>
+          <w:tcPr>
+            <w:tcW w:w="3596" w:type="dxa"/>
+            <w:gridSpan w:val="11"/>
+            <w:tcBorders>
+              <w:left w:val="threeDEngrave" w:sz="12" w:space="0" w:color="E6E6E6"/>
+              <w:bottom w:val="threeDEngrave" w:sz="12" w:space="0" w:color="E6E6E6"/>
+            </w:tcBorders>
+            <w:shd w:val="clear" w:color="auto" w:fill="DDDDDD"/>
+            <w:vAlign w:val="center"/>
+          </w:tcPr>
+          <w:p>
+            <w:pPr>
+              <w:snapToGrid w:val="0"/>
+              <w:jc w:val="center"/>
+            </w:pPr>
+            <w:r>
+              <w:rPr>
+                <w:rFonts w:ascii="Arial" w:hAnsi="Arial" w:cs="Arial"/>
+                <w:b/>
+                <w:color w:val="000000"/>
+                <w:sz w:val="14"/>
+                <w:szCs w:val="14"/>
+              </w:rPr>
+              <w:t>Límite Inferior</w:t>
+            </w:r>
+          </w:p>
+        </w:tc>
+        <w:tc>
+          <w:tcPr>
+            <w:tcW w:w="3596" w:type="dxa"/>
+            <w:gridSpan w:val="20"/>
+            <w:tcBorders>
+              <w:left w:val="threeDEngrave" w:sz="12" w:space="0" w:color="E6E6E6"/>
+              <w:bottom w:val="threeDEngrave" w:sz="12" w:space="0" w:color="E6E6E6"/>
+            </w:tcBorders>
+            <w:shd w:val="clear" w:color="auto" w:fill="DDDDDD"/>
+            <w:vAlign w:val="center"/>
+          </w:tcPr>
+          <w:p>
+            <w:pPr>
+              <w:snapToGrid w:val="0"/>
+              <w:jc w:val="center"/>
+            </w:pPr>
+            <w:r>
+              <w:rPr>
+                <w:rFonts w:ascii="Arial" w:hAnsi="Arial" w:cs="Arial"/>
+                <w:b/>
+                <w:color w:val="000000"/>
+                <w:sz w:val="14"/>
+                <w:szCs w:val="14"/>
+              </w:rPr>
+              <w:t>Tasa</w:t>
+            </w:r>
+          </w:p>
+        </w:tc>
+        <w:tc>
+          <w:tcPr>
+            <w:tcW w:w="3686" w:type="dxa"/>
+            <w:gridSpan w:val="15"/>
+            <w:tcBorders>
               <w:left w:val="threeDEngrave" w:sz="12" w:space="0" w:color="E6E6E6"/>
               <w:bottom w:val="threeDEngrave" w:sz="12" w:space="0" w:color="E6E6E6"/>
               <w:right w:val="threeDEngrave" w:sz="12" w:space="0" w:color="E6E6E6"/>
             </w:tcBorders>
-            <w:shd w:val="clear" w:color="auto" w:fill="A6A6A6"/>
-            <w:vAlign w:val="center"/>
-          </w:tcPr>
-          <w:p>
-            <w:pPr>
+            <w:shd w:val="clear" w:color="auto" w:fill="DDDDDD"/>
+            <w:vAlign w:val="center"/>
+          </w:tcPr>
+          <w:p>
+            <w:pPr>
+              <w:snapToGrid w:val="0"/>
               <w:jc w:val="center"/>
             </w:pPr>
             <w:r>
               <w:rPr>
                 <w:rFonts w:ascii="Arial" w:hAnsi="Arial" w:cs="Arial"/>
                 <w:b/>
-                <w:color w:val="FFFFFF"/>
-                <w:sz w:val="18"/>
-                <w:szCs w:val="18"/>
-              </w:rPr>
-              <w:t>VALORES</w:t>
+                <w:color w:val="000000"/>
+                <w:sz w:val="14"/>
+                <w:szCs w:val="14"/>
+              </w:rPr>
+              <w:t>Cuota Fija</w:t>
             </w:r>
           </w:p>
         </w:tc>
@@ -3202,27 +3932,23 @@
             <w:tcW w:w="3596" w:type="dxa"/>
             <w:gridSpan w:val="11"/>
             <w:tcBorders>
-              <w:top w:val="threeDEngrave" w:sz="12" w:space="0" w:color="E6E6E6"/>
-              <w:left w:val="threeDEngrave" w:sz="12" w:space="0" w:color="E6E6E6"/>
-              <w:bottom w:val="threeDEngrave" w:sz="12" w:space="0" w:color="E6E6E6"/>
-            </w:tcBorders>
-            <w:shd w:val="clear" w:color="auto" w:fill="D9D9D9"/>
-            <w:vAlign w:val="center"/>
-          </w:tcPr>
-          <w:p>
-            <w:pPr>
-              <w:jc w:val="center"/>
-            </w:pPr>
-            <w:r>
-              <w:rPr>
-                <w:rFonts w:ascii="Arial" w:hAnsi="Arial" w:cs="Arial"/>
-                <w:b/>
-                <w:color w:val="000000"/>
-                <w:sz w:val="14"/>
-                <w:szCs w:val="14"/>
-              </w:rPr>
-              <w:t>Catastral</w:t>
-            </w:r>
+              <w:left w:val="threeDEngrave" w:sz="12" w:space="0" w:color="E6E6E6"/>
+              <w:bottom w:val="threeDEngrave" w:sz="12" w:space="0" w:color="E6E6E6"/>
+            </w:tcBorders>
+            <w:vAlign w:val="center"/>
+          </w:tcPr>
+          <w:p>
+            <w:pPr>
+              <w:snapToGrid w:val="0"/>
+              <w:jc w:val="right"/>
+              <w:rPr>
+                <w:rFonts w:ascii="Arial" w:hAnsi="Arial" w:cs="Arial"/>
+                <w:b/>
+                <w:color w:val="000000"/>
+                <w:sz w:val="14"/>
+                <w:szCs w:val="14"/>
+              </w:rPr>
+            </w:pPr>
           </w:p>
         </w:tc>
         <w:tc>
@@ -3230,56 +3956,48 @@
             <w:tcW w:w="3596" w:type="dxa"/>
             <w:gridSpan w:val="20"/>
             <w:tcBorders>
-              <w:top w:val="threeDEngrave" w:sz="12" w:space="0" w:color="E6E6E6"/>
-              <w:left w:val="threeDEngrave" w:sz="12" w:space="0" w:color="E6E6E6"/>
-              <w:bottom w:val="threeDEngrave" w:sz="12" w:space="0" w:color="E6E6E6"/>
-            </w:tcBorders>
-            <w:shd w:val="clear" w:color="auto" w:fill="D9D9D9"/>
-            <w:vAlign w:val="center"/>
-          </w:tcPr>
-          <w:p>
-            <w:pPr>
+              <w:left w:val="threeDEngrave" w:sz="12" w:space="0" w:color="E6E6E6"/>
+              <w:bottom w:val="threeDEngrave" w:sz="12" w:space="0" w:color="E6E6E6"/>
+            </w:tcBorders>
+            <w:vAlign w:val="center"/>
+          </w:tcPr>
+          <w:p>
+            <w:pPr>
+              <w:snapToGrid w:val="0"/>
               <w:jc w:val="center"/>
-            </w:pPr>
-            <w:r>
-              <w:rPr>
-                <w:rFonts w:ascii="Arial" w:hAnsi="Arial" w:cs="Arial"/>
-                <w:b/>
-                <w:color w:val="000000"/>
-                <w:sz w:val="14"/>
-                <w:szCs w:val="14"/>
-              </w:rPr>
-              <w:t>De operación</w:t>
-            </w:r>
+              <w:rPr>
+                <w:rFonts w:ascii="Arial" w:hAnsi="Arial" w:cs="Arial"/>
+                <w:b/>
+                <w:color w:val="000000"/>
+                <w:sz w:val="14"/>
+                <w:szCs w:val="14"/>
+              </w:rPr>
+            </w:pPr>
           </w:p>
         </w:tc>
         <w:tc>
           <w:tcPr>
             <w:tcW w:w="3686" w:type="dxa"/>
-            <w:gridSpan w:val="16"/>
-            <w:tcBorders>
-              <w:top w:val="threeDEngrave" w:sz="12" w:space="0" w:color="E6E6E6"/>
+            <w:gridSpan w:val="15"/>
+            <w:tcBorders>
               <w:left w:val="threeDEngrave" w:sz="12" w:space="0" w:color="E6E6E6"/>
               <w:bottom w:val="threeDEngrave" w:sz="12" w:space="0" w:color="E6E6E6"/>
               <w:right w:val="threeDEngrave" w:sz="12" w:space="0" w:color="E6E6E6"/>
             </w:tcBorders>
-            <w:shd w:val="clear" w:color="auto" w:fill="D9D9D9"/>
-            <w:vAlign w:val="center"/>
-          </w:tcPr>
-          <w:p>
-            <w:pPr>
+            <w:vAlign w:val="center"/>
+          </w:tcPr>
+          <w:p>
+            <w:pPr>
+              <w:snapToGrid w:val="0"/>
               <w:jc w:val="center"/>
-            </w:pPr>
-            <w:r>
-              <w:rPr>
-                <w:rFonts w:ascii="Arial" w:hAnsi="Arial" w:cs="Arial"/>
-                <w:b/>
-                <w:color w:val="000000"/>
-                <w:sz w:val="14"/>
-                <w:szCs w:val="14"/>
-              </w:rPr>
-              <w:t>De avalúo</w:t>
-            </w:r>
+              <w:rPr>
+                <w:rFonts w:ascii="Arial" w:hAnsi="Arial" w:cs="Arial"/>
+                <w:b/>
+                <w:color w:val="000000"/>
+                <w:sz w:val="14"/>
+                <w:szCs w:val="14"/>
+              </w:rPr>
+            </w:pPr>
           </w:p>
         </w:tc>
       </w:tr>
@@ -3301,111 +4019,42 @@
           <w:p>
             <w:pPr>
               <w:snapToGrid w:val="0"/>
-            </w:pPr>
-          </w:p>
-        </w:tc>
-        <w:tc>
-          <w:tcPr>
-            <w:tcW w:w="3596" w:type="dxa"/>
-            <w:gridSpan w:val="11"/>
+              <w:rPr>
+                <w:rFonts w:ascii="Arial" w:hAnsi="Arial" w:cs="Arial"/>
+                <w:b/>
+                <w:color w:val="000000"/>
+                <w:sz w:val="16"/>
+                <w:szCs w:val="16"/>
+              </w:rPr>
+            </w:pPr>
+          </w:p>
+        </w:tc>
+        <w:tc>
+          <w:tcPr>
+            <w:tcW w:w="10878" w:type="dxa"/>
+            <w:gridSpan w:val="46"/>
             <w:tcBorders>
               <w:top w:val="threeDEngrave" w:sz="12" w:space="0" w:color="E6E6E6"/>
               <w:left w:val="threeDEngrave" w:sz="12" w:space="0" w:color="E6E6E6"/>
               <w:bottom w:val="threeDEngrave" w:sz="12" w:space="0" w:color="E6E6E6"/>
-            </w:tcBorders>
-            <w:vAlign w:val="center"/>
-          </w:tcPr>
-          <w:p>
-            <w:pPr>
-              <w:snapToGrid w:val="0"/>
+              <w:right w:val="threeDEngrave" w:sz="12" w:space="0" w:color="E6E6E6"/>
+            </w:tcBorders>
+            <w:shd w:val="clear" w:color="auto" w:fill="999999"/>
+            <w:vAlign w:val="center"/>
+          </w:tcPr>
+          <w:p>
+            <w:pPr>
               <w:jc w:val="center"/>
-              <w:rPr>
-                <w:rFonts w:ascii="Arial" w:hAnsi="Arial" w:cs="Arial"/>
-                <w:b/>
-                <w:color w:val="000000"/>
-                <w:sz w:val="14"/>
-                <w:szCs w:val="14"/>
-              </w:rPr>
-            </w:pPr>
-            <w:r>
-              <w:rPr>
-                <w:rFonts w:ascii="Arial" w:hAnsi="Arial" w:cs="Arial"/>
-                <w:b/>
-                <w:color w:val="000000"/>
-                <w:sz w:val="14"/>
-                <w:szCs w:val="14"/>
-              </w:rPr>
-              <w:t>{{ valor_catastral }}</w:t>
-            </w:r>
-          </w:p>
-        </w:tc>
-        <w:tc>
-          <w:tcPr>
-            <w:tcW w:w="3596" w:type="dxa"/>
-            <w:gridSpan w:val="20"/>
-            <w:tcBorders>
-              <w:top w:val="threeDEngrave" w:sz="12" w:space="0" w:color="E6E6E6"/>
-              <w:left w:val="threeDEngrave" w:sz="12" w:space="0" w:color="E6E6E6"/>
-              <w:bottom w:val="threeDEngrave" w:sz="12" w:space="0" w:color="E6E6E6"/>
-            </w:tcBorders>
-            <w:vAlign w:val="center"/>
-          </w:tcPr>
-          <w:p>
-            <w:pPr>
-              <w:snapToGrid w:val="0"/>
-              <w:jc w:val="center"/>
-              <w:rPr>
-                <w:rFonts w:ascii="Arial" w:hAnsi="Arial" w:cs="Arial"/>
-                <w:b/>
-                <w:color w:val="000000"/>
-                <w:sz w:val="14"/>
-                <w:szCs w:val="14"/>
-              </w:rPr>
-            </w:pPr>
-            <w:r>
-              <w:rPr>
-                <w:rFonts w:ascii="Arial" w:hAnsi="Arial" w:cs="Arial"/>
-                <w:b/>
-                <w:color w:val="000000"/>
-                <w:sz w:val="14"/>
-                <w:szCs w:val="14"/>
-              </w:rPr>
-              <w:t>{{ valor_operacion }}</w:t>
-            </w:r>
-          </w:p>
-        </w:tc>
-        <w:tc>
-          <w:tcPr>
-            <w:tcW w:w="3686" w:type="dxa"/>
-            <w:gridSpan w:val="16"/>
-            <w:tcBorders>
-              <w:top w:val="threeDEngrave" w:sz="12" w:space="0" w:color="E6E6E6"/>
-              <w:left w:val="threeDEngrave" w:sz="12" w:space="0" w:color="E6E6E6"/>
-              <w:bottom w:val="threeDEngrave" w:sz="12" w:space="0" w:color="E6E6E6"/>
-              <w:right w:val="threeDEngrave" w:sz="12" w:space="0" w:color="E6E6E6"/>
-            </w:tcBorders>
-            <w:vAlign w:val="center"/>
-          </w:tcPr>
-          <w:p>
-            <w:pPr>
-              <w:snapToGrid w:val="0"/>
-              <w:rPr>
-                <w:rFonts w:ascii="Arial" w:hAnsi="Arial" w:cs="Arial"/>
-                <w:b/>
-                <w:color w:val="000000"/>
-                <w:sz w:val="14"/>
-                <w:szCs w:val="14"/>
-              </w:rPr>
-            </w:pPr>
-            <w:r>
-              <w:rPr>
-                <w:rFonts w:ascii="Arial" w:hAnsi="Arial" w:cs="Arial"/>
-                <w:b/>
-                <w:color w:val="000000"/>
-                <w:sz w:val="14"/>
-                <w:szCs w:val="14"/>
-              </w:rPr>
-              <w:t>{{ valor_avaluo }}</w:t>
+            </w:pPr>
+            <w:r>
+              <w:rPr>
+                <w:rFonts w:ascii="Arial" w:hAnsi="Arial" w:cs="Arial"/>
+                <w:b/>
+                <w:color w:val="FFFFFF"/>
+                <w:sz w:val="18"/>
+                <w:szCs w:val="18"/>
+              </w:rPr>
+              <w:t>LIQUIDACIÓN</w:t>
             </w:r>
           </w:p>
         </w:tc>
@@ -3428,13 +4077,6 @@
           <w:p>
             <w:pPr>
               <w:snapToGrid w:val="0"/>
-              <w:rPr>
-                <w:rFonts w:ascii="Arial" w:hAnsi="Arial" w:cs="Arial"/>
-                <w:b/>
-                <w:color w:val="000000"/>
-                <w:sz w:val="16"/>
-                <w:szCs w:val="16"/>
-              </w:rPr>
             </w:pPr>
           </w:p>
         </w:tc>
@@ -3446,11 +4088,11 @@
               <w:left w:val="threeDEngrave" w:sz="12" w:space="0" w:color="E6E6E6"/>
               <w:bottom w:val="threeDEngrave" w:sz="12" w:space="0" w:color="E6E6E6"/>
             </w:tcBorders>
-            <w:vAlign w:val="center"/>
-          </w:tcPr>
-          <w:p>
-            <w:pPr>
-              <w:snapToGrid w:val="0"/>
+            <w:shd w:val="clear" w:color="auto" w:fill="DDDDDD"/>
+            <w:vAlign w:val="center"/>
+          </w:tcPr>
+          <w:p>
+            <w:pPr>
               <w:jc w:val="right"/>
             </w:pPr>
             <w:r>
@@ -3461,14 +4103,14 @@
                 <w:sz w:val="14"/>
                 <w:szCs w:val="14"/>
               </w:rPr>
-              <w:t>Porcentaje total transmitido:</w:t>
+              <w:t>Impuesto:</w:t>
             </w:r>
           </w:p>
         </w:tc>
         <w:tc>
           <w:tcPr>
             <w:tcW w:w="3686" w:type="dxa"/>
-            <w:gridSpan w:val="16"/>
+            <w:gridSpan w:val="15"/>
             <w:tcBorders>
               <w:left w:val="threeDEngrave" w:sz="12" w:space="0" w:color="E6E6E6"/>
               <w:bottom w:val="threeDEngrave" w:sz="12" w:space="0" w:color="E6E6E6"/>
@@ -3477,16 +4119,26 @@
             <w:vAlign w:val="center"/>
           </w:tcPr>
           <w:p>
-            <w:pPr>
-              <w:snapToGrid w:val="0"/>
-              <w:jc w:val="center"/>
-              <w:rPr>
-                <w:rFonts w:ascii="Arial" w:hAnsi="Arial" w:cs="Arial"/>
-                <w:color w:val="000000"/>
-                <w:sz w:val="14"/>
-                <w:szCs w:val="14"/>
-              </w:rPr>
-            </w:pPr>
+            <w:r>
+              <w:rPr>
+                <w:rFonts w:ascii="Arial" w:hAnsi="Arial" w:cs="Arial"/>
+                <w:b/>
+                <w:color w:val="000000"/>
+                <w:sz w:val="14"/>
+                <w:szCs w:val="14"/>
+              </w:rPr>
+              <w:t xml:space="preserve">$ </w:t>
+            </w:r>
+            <w:r>
+              <w:rPr>
+                <w:rFonts w:ascii="Arial" w:hAnsi="Arial" w:cs="Arial"/>
+                <w:b/>
+                <w:color w:val="000000"/>
+                <w:sz w:val="14"/>
+                <w:szCs w:val="14"/>
+              </w:rPr>
+              <w:t>{{ impuesto_monto }}</w:t>
+            </w:r>
           </w:p>
         </w:tc>
       </w:tr>
@@ -3508,12 +4160,6 @@
           <w:p>
             <w:pPr>
               <w:snapToGrid w:val="0"/>
-              <w:rPr>
-                <w:rFonts w:ascii="Arial" w:hAnsi="Arial" w:cs="Arial"/>
-                <w:color w:val="000000"/>
-                <w:sz w:val="16"/>
-                <w:szCs w:val="16"/>
-              </w:rPr>
             </w:pPr>
           </w:p>
         </w:tc>
@@ -3525,11 +4171,11 @@
               <w:left w:val="threeDEngrave" w:sz="12" w:space="0" w:color="E6E6E6"/>
               <w:bottom w:val="threeDEngrave" w:sz="12" w:space="0" w:color="E6E6E6"/>
             </w:tcBorders>
-            <w:vAlign w:val="center"/>
-          </w:tcPr>
-          <w:p>
-            <w:pPr>
-              <w:snapToGrid w:val="0"/>
+            <w:shd w:val="clear" w:color="auto" w:fill="DDDDDD"/>
+            <w:vAlign w:val="center"/>
+          </w:tcPr>
+          <w:p>
+            <w:pPr>
               <w:jc w:val="right"/>
             </w:pPr>
             <w:r>
@@ -3540,14 +4186,14 @@
                 <w:sz w:val="14"/>
                 <w:szCs w:val="14"/>
               </w:rPr>
-              <w:t>Base para cálculo del impuesto (después de aplicar beneficios según ley):</w:t>
+              <w:t>Recargos:</w:t>
             </w:r>
           </w:p>
         </w:tc>
         <w:tc>
           <w:tcPr>
             <w:tcW w:w="3686" w:type="dxa"/>
-            <w:gridSpan w:val="16"/>
+            <w:gridSpan w:val="15"/>
             <w:tcBorders>
               <w:left w:val="threeDEngrave" w:sz="12" w:space="0" w:color="E6E6E6"/>
               <w:bottom w:val="threeDEngrave" w:sz="12" w:space="0" w:color="E6E6E6"/>
@@ -3556,16 +4202,16 @@
             <w:vAlign w:val="center"/>
           </w:tcPr>
           <w:p>
-            <w:pPr>
-              <w:snapToGrid w:val="0"/>
-              <w:jc w:val="center"/>
-              <w:rPr>
-                <w:rFonts w:ascii="Arial" w:hAnsi="Arial" w:cs="Arial"/>
-                <w:color w:val="000000"/>
-                <w:sz w:val="14"/>
-                <w:szCs w:val="14"/>
-              </w:rPr>
-            </w:pPr>
+            <w:r>
+              <w:rPr>
+                <w:rFonts w:ascii="Arial" w:hAnsi="Arial" w:cs="Arial"/>
+                <w:b/>
+                <w:color w:val="000000"/>
+                <w:sz w:val="14"/>
+                <w:szCs w:val="14"/>
+              </w:rPr>
+              <w:t xml:space="preserve">$ </w:t>
+            </w:r>
           </w:p>
         </w:tc>
       </w:tr>
@@ -3587,41 +4233,57 @@
           <w:p>
             <w:pPr>
               <w:snapToGrid w:val="0"/>
-              <w:rPr>
-                <w:rFonts w:ascii="Arial" w:hAnsi="Arial" w:cs="Arial"/>
-                <w:color w:val="000000"/>
-                <w:sz w:val="16"/>
-                <w:szCs w:val="16"/>
-              </w:rPr>
-            </w:pPr>
-          </w:p>
-        </w:tc>
-        <w:tc>
-          <w:tcPr>
-            <w:tcW w:w="10878" w:type="dxa"/>
-            <w:gridSpan w:val="47"/>
+            </w:pPr>
+          </w:p>
+        </w:tc>
+        <w:tc>
+          <w:tcPr>
+            <w:tcW w:w="7192" w:type="dxa"/>
+            <w:gridSpan w:val="31"/>
+            <w:tcBorders>
+              <w:left w:val="threeDEngrave" w:sz="12" w:space="0" w:color="E6E6E6"/>
+              <w:bottom w:val="threeDEngrave" w:sz="12" w:space="0" w:color="E6E6E6"/>
+            </w:tcBorders>
+            <w:shd w:val="clear" w:color="auto" w:fill="DDDDDD"/>
+            <w:vAlign w:val="center"/>
+          </w:tcPr>
+          <w:p>
+            <w:pPr>
+              <w:jc w:val="right"/>
+            </w:pPr>
+            <w:r>
+              <w:rPr>
+                <w:rFonts w:ascii="Arial" w:hAnsi="Arial" w:cs="Arial"/>
+                <w:b/>
+                <w:color w:val="000000"/>
+                <w:sz w:val="14"/>
+                <w:szCs w:val="14"/>
+              </w:rPr>
+              <w:t>Multa Por Presentación Extemporánea:</w:t>
+            </w:r>
+          </w:p>
+        </w:tc>
+        <w:tc>
+          <w:tcPr>
+            <w:tcW w:w="3686" w:type="dxa"/>
+            <w:gridSpan w:val="15"/>
             <w:tcBorders>
               <w:left w:val="threeDEngrave" w:sz="12" w:space="0" w:color="E6E6E6"/>
               <w:bottom w:val="threeDEngrave" w:sz="12" w:space="0" w:color="E6E6E6"/>
               <w:right w:val="threeDEngrave" w:sz="12" w:space="0" w:color="E6E6E6"/>
             </w:tcBorders>
-            <w:shd w:val="clear" w:color="auto" w:fill="999999"/>
-            <w:vAlign w:val="center"/>
-          </w:tcPr>
-          <w:p>
-            <w:pPr>
-              <w:snapToGrid w:val="0"/>
-              <w:jc w:val="center"/>
-            </w:pPr>
-            <w:r>
-              <w:rPr>
-                <w:rFonts w:ascii="Arial" w:hAnsi="Arial" w:cs="Arial"/>
-                <w:b/>
-                <w:color w:val="FFFFFF"/>
-                <w:sz w:val="18"/>
-                <w:szCs w:val="18"/>
-              </w:rPr>
-              <w:t>TABULADOR SEGÚN LEY DE INGRESOS</w:t>
+            <w:vAlign w:val="center"/>
+          </w:tcPr>
+          <w:p>
+            <w:r>
+              <w:rPr>
+                <w:rFonts w:ascii="Arial" w:hAnsi="Arial" w:cs="Arial"/>
+                <w:b/>
+                <w:color w:val="000000"/>
+                <w:sz w:val="14"/>
+                <w:szCs w:val="14"/>
+              </w:rPr>
+              <w:t>$</w:t>
             </w:r>
           </w:p>
         </w:tc>
@@ -3649,8 +4311,8 @@
         </w:tc>
         <w:tc>
           <w:tcPr>
-            <w:tcW w:w="3596" w:type="dxa"/>
-            <w:gridSpan w:val="11"/>
+            <w:tcW w:w="7192" w:type="dxa"/>
+            <w:gridSpan w:val="31"/>
             <w:tcBorders>
               <w:left w:val="threeDEngrave" w:sz="12" w:space="0" w:color="E6E6E6"/>
               <w:bottom w:val="threeDEngrave" w:sz="12" w:space="0" w:color="E6E6E6"/>
@@ -3660,75 +4322,41 @@
           </w:tcPr>
           <w:p>
             <w:pPr>
-              <w:snapToGrid w:val="0"/>
-              <w:jc w:val="center"/>
-            </w:pPr>
-            <w:r>
-              <w:rPr>
-                <w:rFonts w:ascii="Arial" w:hAnsi="Arial" w:cs="Arial"/>
-                <w:b/>
-                <w:color w:val="000000"/>
-                <w:sz w:val="14"/>
-                <w:szCs w:val="14"/>
-              </w:rPr>
-              <w:t>Límite Inferior</w:t>
-            </w:r>
-          </w:p>
-        </w:tc>
-        <w:tc>
-          <w:tcPr>
-            <w:tcW w:w="3596" w:type="dxa"/>
-            <w:gridSpan w:val="20"/>
-            <w:tcBorders>
-              <w:left w:val="threeDEngrave" w:sz="12" w:space="0" w:color="E6E6E6"/>
-              <w:bottom w:val="threeDEngrave" w:sz="12" w:space="0" w:color="E6E6E6"/>
-            </w:tcBorders>
-            <w:shd w:val="clear" w:color="auto" w:fill="DDDDDD"/>
-            <w:vAlign w:val="center"/>
-          </w:tcPr>
-          <w:p>
-            <w:pPr>
-              <w:snapToGrid w:val="0"/>
-              <w:jc w:val="center"/>
-            </w:pPr>
-            <w:r>
-              <w:rPr>
-                <w:rFonts w:ascii="Arial" w:hAnsi="Arial" w:cs="Arial"/>
-                <w:b/>
-                <w:color w:val="000000"/>
-                <w:sz w:val="14"/>
-                <w:szCs w:val="14"/>
-              </w:rPr>
-              <w:t>Tasa</w:t>
+              <w:jc w:val="right"/>
+            </w:pPr>
+            <w:r>
+              <w:rPr>
+                <w:rFonts w:ascii="Arial" w:hAnsi="Arial" w:cs="Arial"/>
+                <w:b/>
+                <w:color w:val="000000"/>
+                <w:sz w:val="14"/>
+                <w:szCs w:val="14"/>
+              </w:rPr>
+              <w:t>Multa Por Incumplimiento De Pago:</w:t>
             </w:r>
           </w:p>
         </w:tc>
         <w:tc>
           <w:tcPr>
             <w:tcW w:w="3686" w:type="dxa"/>
-            <w:gridSpan w:val="16"/>
+            <w:gridSpan w:val="15"/>
             <w:tcBorders>
               <w:left w:val="threeDEngrave" w:sz="12" w:space="0" w:color="E6E6E6"/>
               <w:bottom w:val="threeDEngrave" w:sz="12" w:space="0" w:color="E6E6E6"/>
               <w:right w:val="threeDEngrave" w:sz="12" w:space="0" w:color="E6E6E6"/>
             </w:tcBorders>
-            <w:shd w:val="clear" w:color="auto" w:fill="DDDDDD"/>
-            <w:vAlign w:val="center"/>
-          </w:tcPr>
-          <w:p>
-            <w:pPr>
-              <w:snapToGrid w:val="0"/>
-              <w:jc w:val="center"/>
-            </w:pPr>
-            <w:r>
-              <w:rPr>
-                <w:rFonts w:ascii="Arial" w:hAnsi="Arial" w:cs="Arial"/>
-                <w:b/>
-                <w:color w:val="000000"/>
-                <w:sz w:val="14"/>
-                <w:szCs w:val="14"/>
-              </w:rPr>
-              <w:t>Cuota Fija</w:t>
+            <w:vAlign w:val="center"/>
+          </w:tcPr>
+          <w:p>
+            <w:r>
+              <w:rPr>
+                <w:rFonts w:ascii="Arial" w:hAnsi="Arial" w:cs="Arial"/>
+                <w:b/>
+                <w:color w:val="000000"/>
+                <w:sz w:val="14"/>
+                <w:szCs w:val="14"/>
+              </w:rPr>
+              <w:t>$</w:t>
             </w:r>
           </w:p>
         </w:tc>
@@ -3756,56 +4384,35 @@
         </w:tc>
         <w:tc>
           <w:tcPr>
-            <w:tcW w:w="3596" w:type="dxa"/>
-            <w:gridSpan w:val="11"/>
-            <w:tcBorders>
-              <w:left w:val="threeDEngrave" w:sz="12" w:space="0" w:color="E6E6E6"/>
-              <w:bottom w:val="threeDEngrave" w:sz="12" w:space="0" w:color="E6E6E6"/>
-            </w:tcBorders>
-            <w:vAlign w:val="center"/>
-          </w:tcPr>
-          <w:p>
-            <w:pPr>
-              <w:snapToGrid w:val="0"/>
+            <w:tcW w:w="7192" w:type="dxa"/>
+            <w:gridSpan w:val="31"/>
+            <w:tcBorders>
+              <w:left w:val="threeDEngrave" w:sz="12" w:space="0" w:color="E6E6E6"/>
+              <w:bottom w:val="threeDEngrave" w:sz="12" w:space="0" w:color="E6E6E6"/>
+            </w:tcBorders>
+            <w:shd w:val="clear" w:color="auto" w:fill="DDDDDD"/>
+            <w:vAlign w:val="center"/>
+          </w:tcPr>
+          <w:p>
+            <w:pPr>
               <w:jc w:val="right"/>
-              <w:rPr>
-                <w:rFonts w:ascii="Arial" w:hAnsi="Arial" w:cs="Arial"/>
-                <w:b/>
-                <w:color w:val="000000"/>
-                <w:sz w:val="14"/>
-                <w:szCs w:val="14"/>
-              </w:rPr>
-            </w:pPr>
-          </w:p>
-        </w:tc>
-        <w:tc>
-          <w:tcPr>
-            <w:tcW w:w="3596" w:type="dxa"/>
-            <w:gridSpan w:val="20"/>
-            <w:tcBorders>
-              <w:left w:val="threeDEngrave" w:sz="12" w:space="0" w:color="E6E6E6"/>
-              <w:bottom w:val="threeDEngrave" w:sz="12" w:space="0" w:color="E6E6E6"/>
-            </w:tcBorders>
-            <w:vAlign w:val="center"/>
-          </w:tcPr>
-          <w:p>
-            <w:pPr>
-              <w:snapToGrid w:val="0"/>
-              <w:jc w:val="center"/>
-              <w:rPr>
-                <w:rFonts w:ascii="Arial" w:hAnsi="Arial" w:cs="Arial"/>
-                <w:b/>
-                <w:color w:val="000000"/>
-                <w:sz w:val="14"/>
-                <w:szCs w:val="14"/>
-              </w:rPr>
-            </w:pPr>
+            </w:pPr>
+            <w:r>
+              <w:rPr>
+                <w:rFonts w:ascii="Arial" w:hAnsi="Arial" w:cs="Arial"/>
+                <w:b/>
+                <w:color w:val="000000"/>
+                <w:sz w:val="14"/>
+                <w:szCs w:val="14"/>
+              </w:rPr>
+              <w:t>Actualizaciones Según INPC:</w:t>
+            </w:r>
           </w:p>
         </w:tc>
         <w:tc>
           <w:tcPr>
             <w:tcW w:w="3686" w:type="dxa"/>
-            <w:gridSpan w:val="16"/>
+            <w:gridSpan w:val="15"/>
             <w:tcBorders>
               <w:left w:val="threeDEngrave" w:sz="12" w:space="0" w:color="E6E6E6"/>
               <w:bottom w:val="threeDEngrave" w:sz="12" w:space="0" w:color="E6E6E6"/>
@@ -3814,17 +4421,16 @@
             <w:vAlign w:val="center"/>
           </w:tcPr>
           <w:p>
-            <w:pPr>
-              <w:snapToGrid w:val="0"/>
-              <w:jc w:val="center"/>
-              <w:rPr>
-                <w:rFonts w:ascii="Arial" w:hAnsi="Arial" w:cs="Arial"/>
-                <w:b/>
-                <w:color w:val="000000"/>
-                <w:sz w:val="14"/>
-                <w:szCs w:val="14"/>
-              </w:rPr>
-            </w:pPr>
+            <w:r>
+              <w:rPr>
+                <w:rFonts w:ascii="Arial" w:hAnsi="Arial" w:cs="Arial"/>
+                <w:b/>
+                <w:color w:val="000000"/>
+                <w:sz w:val="14"/>
+                <w:szCs w:val="14"/>
+              </w:rPr>
+              <w:t>$</w:t>
+            </w:r>
           </w:p>
         </w:tc>
       </w:tr>
@@ -3846,42 +4452,67 @@
           <w:p>
             <w:pPr>
               <w:snapToGrid w:val="0"/>
-              <w:rPr>
-                <w:rFonts w:ascii="Arial" w:hAnsi="Arial" w:cs="Arial"/>
-                <w:b/>
-                <w:color w:val="000000"/>
-                <w:sz w:val="16"/>
-                <w:szCs w:val="16"/>
-              </w:rPr>
-            </w:pPr>
-          </w:p>
-        </w:tc>
-        <w:tc>
-          <w:tcPr>
-            <w:tcW w:w="10878" w:type="dxa"/>
-            <w:gridSpan w:val="47"/>
-            <w:tcBorders>
-              <w:top w:val="threeDEngrave" w:sz="12" w:space="0" w:color="E6E6E6"/>
+            </w:pPr>
+          </w:p>
+        </w:tc>
+        <w:tc>
+          <w:tcPr>
+            <w:tcW w:w="7192" w:type="dxa"/>
+            <w:gridSpan w:val="31"/>
+            <w:tcBorders>
+              <w:left w:val="threeDEngrave" w:sz="12" w:space="0" w:color="E6E6E6"/>
+              <w:bottom w:val="threeDEngrave" w:sz="12" w:space="0" w:color="E6E6E6"/>
+            </w:tcBorders>
+            <w:shd w:val="clear" w:color="auto" w:fill="DDDDDD"/>
+            <w:vAlign w:val="center"/>
+          </w:tcPr>
+          <w:p>
+            <w:pPr>
+              <w:jc w:val="right"/>
+            </w:pPr>
+            <w:r>
+              <w:rPr>
+                <w:rFonts w:ascii="Arial" w:hAnsi="Arial" w:cs="Arial"/>
+                <w:b/>
+                <w:color w:val="000000"/>
+                <w:sz w:val="14"/>
+                <w:szCs w:val="14"/>
+              </w:rPr>
+              <w:t>TOTAL:</w:t>
+            </w:r>
+          </w:p>
+        </w:tc>
+        <w:tc>
+          <w:tcPr>
+            <w:tcW w:w="3686" w:type="dxa"/>
+            <w:gridSpan w:val="15"/>
+            <w:tcBorders>
               <w:left w:val="threeDEngrave" w:sz="12" w:space="0" w:color="E6E6E6"/>
               <w:bottom w:val="threeDEngrave" w:sz="12" w:space="0" w:color="E6E6E6"/>
               <w:right w:val="threeDEngrave" w:sz="12" w:space="0" w:color="E6E6E6"/>
             </w:tcBorders>
-            <w:shd w:val="clear" w:color="auto" w:fill="999999"/>
-            <w:vAlign w:val="center"/>
-          </w:tcPr>
-          <w:p>
-            <w:pPr>
-              <w:jc w:val="center"/>
-            </w:pPr>
-            <w:r>
-              <w:rPr>
-                <w:rFonts w:ascii="Arial" w:hAnsi="Arial" w:cs="Arial"/>
-                <w:b/>
-                <w:color w:val="FFFFFF"/>
-                <w:sz w:val="18"/>
-                <w:szCs w:val="18"/>
-              </w:rPr>
-              <w:t>LIQUIDACIÓN</w:t>
+            <w:vAlign w:val="center"/>
+          </w:tcPr>
+          <w:p>
+            <w:r>
+              <w:rPr>
+                <w:rFonts w:ascii="Arial" w:hAnsi="Arial" w:cs="Arial"/>
+                <w:b/>
+                <w:color w:val="000000"/>
+                <w:sz w:val="14"/>
+                <w:szCs w:val="14"/>
+              </w:rPr>
+              <w:t xml:space="preserve">$ </w:t>
+            </w:r>
+            <w:r>
+              <w:rPr>
+                <w:rFonts w:ascii="Arial" w:hAnsi="Arial" w:cs="Arial"/>
+                <w:b/>
+                <w:color w:val="000000"/>
+                <w:sz w:val="14"/>
+                <w:szCs w:val="14"/>
+              </w:rPr>
+              <w:t>{{ total_liquidacion }}</w:t>
             </w:r>
           </w:p>
         </w:tc>
@@ -3909,476 +4540,8 @@
         </w:tc>
         <w:tc>
           <w:tcPr>
-            <w:tcW w:w="7192" w:type="dxa"/>
-            <w:gridSpan w:val="31"/>
-            <w:tcBorders>
-              <w:left w:val="threeDEngrave" w:sz="12" w:space="0" w:color="E6E6E6"/>
-              <w:bottom w:val="threeDEngrave" w:sz="12" w:space="0" w:color="E6E6E6"/>
-            </w:tcBorders>
-            <w:shd w:val="clear" w:color="auto" w:fill="DDDDDD"/>
-            <w:vAlign w:val="center"/>
-          </w:tcPr>
-          <w:p>
-            <w:pPr>
-              <w:jc w:val="right"/>
-            </w:pPr>
-            <w:r>
-              <w:rPr>
-                <w:rFonts w:ascii="Arial" w:hAnsi="Arial" w:cs="Arial"/>
-                <w:b/>
-                <w:color w:val="000000"/>
-                <w:sz w:val="14"/>
-                <w:szCs w:val="14"/>
-              </w:rPr>
-              <w:t>Impuesto:</w:t>
-            </w:r>
-          </w:p>
-        </w:tc>
-        <w:tc>
-          <w:tcPr>
-            <w:tcW w:w="3686" w:type="dxa"/>
-            <w:gridSpan w:val="16"/>
-            <w:tcBorders>
-              <w:left w:val="threeDEngrave" w:sz="12" w:space="0" w:color="E6E6E6"/>
-              <w:bottom w:val="threeDEngrave" w:sz="12" w:space="0" w:color="E6E6E6"/>
-              <w:right w:val="threeDEngrave" w:sz="12" w:space="0" w:color="E6E6E6"/>
-            </w:tcBorders>
-            <w:vAlign w:val="center"/>
-          </w:tcPr>
-          <w:p>
-            <w:r>
-              <w:rPr>
-                <w:rFonts w:ascii="Arial" w:hAnsi="Arial" w:cs="Arial"/>
-                <w:b/>
-                <w:color w:val="000000"/>
-                <w:sz w:val="14"/>
-                <w:szCs w:val="14"/>
-              </w:rPr>
-              <w:t xml:space="preserve">$ </w:t>
-            </w:r>
-            <w:r>
-              <w:rPr>
-                <w:rFonts w:ascii="Arial" w:hAnsi="Arial" w:cs="Arial"/>
-                <w:b/>
-                <w:color w:val="000000"/>
-                <w:sz w:val="14"/>
-                <w:szCs w:val="14"/>
-              </w:rPr>
-              <w:t>{{ impuesto_monto }}</w:t>
-            </w:r>
-          </w:p>
-        </w:tc>
-      </w:tr>
-      <w:tr>
-        <w:tblPrEx>
-          <w:tblCellMar>
-            <w:left w:w="108" w:type="dxa"/>
-            <w:right w:w="108" w:type="dxa"/>
-          </w:tblCellMar>
-        </w:tblPrEx>
-        <w:trPr>
-          <w:gridAfter w:val="1"/>
-          <w:wAfter w:w="12" w:type="dxa"/>
-        </w:trPr>
-        <w:tc>
-          <w:tcPr>
-            <w:tcW w:w="236" w:type="dxa"/>
-          </w:tcPr>
-          <w:p>
-            <w:pPr>
-              <w:snapToGrid w:val="0"/>
-            </w:pPr>
-          </w:p>
-        </w:tc>
-        <w:tc>
-          <w:tcPr>
-            <w:tcW w:w="7192" w:type="dxa"/>
-            <w:gridSpan w:val="31"/>
-            <w:tcBorders>
-              <w:left w:val="threeDEngrave" w:sz="12" w:space="0" w:color="E6E6E6"/>
-              <w:bottom w:val="threeDEngrave" w:sz="12" w:space="0" w:color="E6E6E6"/>
-            </w:tcBorders>
-            <w:shd w:val="clear" w:color="auto" w:fill="DDDDDD"/>
-            <w:vAlign w:val="center"/>
-          </w:tcPr>
-          <w:p>
-            <w:pPr>
-              <w:jc w:val="right"/>
-            </w:pPr>
-            <w:r>
-              <w:rPr>
-                <w:rFonts w:ascii="Arial" w:hAnsi="Arial" w:cs="Arial"/>
-                <w:b/>
-                <w:color w:val="000000"/>
-                <w:sz w:val="14"/>
-                <w:szCs w:val="14"/>
-              </w:rPr>
-              <w:t>Recargos:</w:t>
-            </w:r>
-          </w:p>
-        </w:tc>
-        <w:tc>
-          <w:tcPr>
-            <w:tcW w:w="3686" w:type="dxa"/>
-            <w:gridSpan w:val="16"/>
-            <w:tcBorders>
-              <w:left w:val="threeDEngrave" w:sz="12" w:space="0" w:color="E6E6E6"/>
-              <w:bottom w:val="threeDEngrave" w:sz="12" w:space="0" w:color="E6E6E6"/>
-              <w:right w:val="threeDEngrave" w:sz="12" w:space="0" w:color="E6E6E6"/>
-            </w:tcBorders>
-            <w:vAlign w:val="center"/>
-          </w:tcPr>
-          <w:p>
-            <w:r>
-              <w:rPr>
-                <w:rFonts w:ascii="Arial" w:hAnsi="Arial" w:cs="Arial"/>
-                <w:b/>
-                <w:color w:val="000000"/>
-                <w:sz w:val="14"/>
-                <w:szCs w:val="14"/>
-              </w:rPr>
-              <w:t xml:space="preserve">$ </w:t>
-            </w:r>
-          </w:p>
-        </w:tc>
-      </w:tr>
-      <w:tr>
-        <w:tblPrEx>
-          <w:tblCellMar>
-            <w:left w:w="108" w:type="dxa"/>
-            <w:right w:w="108" w:type="dxa"/>
-          </w:tblCellMar>
-        </w:tblPrEx>
-        <w:trPr>
-          <w:gridAfter w:val="1"/>
-          <w:wAfter w:w="12" w:type="dxa"/>
-        </w:trPr>
-        <w:tc>
-          <w:tcPr>
-            <w:tcW w:w="236" w:type="dxa"/>
-          </w:tcPr>
-          <w:p>
-            <w:pPr>
-              <w:snapToGrid w:val="0"/>
-            </w:pPr>
-          </w:p>
-        </w:tc>
-        <w:tc>
-          <w:tcPr>
-            <w:tcW w:w="7192" w:type="dxa"/>
-            <w:gridSpan w:val="31"/>
-            <w:tcBorders>
-              <w:left w:val="threeDEngrave" w:sz="12" w:space="0" w:color="E6E6E6"/>
-              <w:bottom w:val="threeDEngrave" w:sz="12" w:space="0" w:color="E6E6E6"/>
-            </w:tcBorders>
-            <w:shd w:val="clear" w:color="auto" w:fill="DDDDDD"/>
-            <w:vAlign w:val="center"/>
-          </w:tcPr>
-          <w:p>
-            <w:pPr>
-              <w:jc w:val="right"/>
-            </w:pPr>
-            <w:r>
-              <w:rPr>
-                <w:rFonts w:ascii="Arial" w:hAnsi="Arial" w:cs="Arial"/>
-                <w:b/>
-                <w:color w:val="000000"/>
-                <w:sz w:val="14"/>
-                <w:szCs w:val="14"/>
-              </w:rPr>
-              <w:t>Multa Por Presentación Extemporánea:</w:t>
-            </w:r>
-          </w:p>
-        </w:tc>
-        <w:tc>
-          <w:tcPr>
-            <w:tcW w:w="3686" w:type="dxa"/>
-            <w:gridSpan w:val="16"/>
-            <w:tcBorders>
-              <w:left w:val="threeDEngrave" w:sz="12" w:space="0" w:color="E6E6E6"/>
-              <w:bottom w:val="threeDEngrave" w:sz="12" w:space="0" w:color="E6E6E6"/>
-              <w:right w:val="threeDEngrave" w:sz="12" w:space="0" w:color="E6E6E6"/>
-            </w:tcBorders>
-            <w:vAlign w:val="center"/>
-          </w:tcPr>
-          <w:p>
-            <w:r>
-              <w:rPr>
-                <w:rFonts w:ascii="Arial" w:hAnsi="Arial" w:cs="Arial"/>
-                <w:b/>
-                <w:color w:val="000000"/>
-                <w:sz w:val="14"/>
-                <w:szCs w:val="14"/>
-              </w:rPr>
-              <w:t>$</w:t>
-            </w:r>
-          </w:p>
-        </w:tc>
-      </w:tr>
-      <w:tr>
-        <w:tblPrEx>
-          <w:tblCellMar>
-            <w:left w:w="108" w:type="dxa"/>
-            <w:right w:w="108" w:type="dxa"/>
-          </w:tblCellMar>
-        </w:tblPrEx>
-        <w:trPr>
-          <w:gridAfter w:val="1"/>
-          <w:wAfter w:w="12" w:type="dxa"/>
-        </w:trPr>
-        <w:tc>
-          <w:tcPr>
-            <w:tcW w:w="236" w:type="dxa"/>
-          </w:tcPr>
-          <w:p>
-            <w:pPr>
-              <w:snapToGrid w:val="0"/>
-            </w:pPr>
-          </w:p>
-        </w:tc>
-        <w:tc>
-          <w:tcPr>
-            <w:tcW w:w="7192" w:type="dxa"/>
-            <w:gridSpan w:val="31"/>
-            <w:tcBorders>
-              <w:left w:val="threeDEngrave" w:sz="12" w:space="0" w:color="E6E6E6"/>
-              <w:bottom w:val="threeDEngrave" w:sz="12" w:space="0" w:color="E6E6E6"/>
-            </w:tcBorders>
-            <w:shd w:val="clear" w:color="auto" w:fill="DDDDDD"/>
-            <w:vAlign w:val="center"/>
-          </w:tcPr>
-          <w:p>
-            <w:pPr>
-              <w:jc w:val="right"/>
-            </w:pPr>
-            <w:r>
-              <w:rPr>
-                <w:rFonts w:ascii="Arial" w:hAnsi="Arial" w:cs="Arial"/>
-                <w:b/>
-                <w:color w:val="000000"/>
-                <w:sz w:val="14"/>
-                <w:szCs w:val="14"/>
-              </w:rPr>
-              <w:t>Multa Por Incumplimiento De Pago:</w:t>
-            </w:r>
-          </w:p>
-        </w:tc>
-        <w:tc>
-          <w:tcPr>
-            <w:tcW w:w="3686" w:type="dxa"/>
-            <w:gridSpan w:val="16"/>
-            <w:tcBorders>
-              <w:left w:val="threeDEngrave" w:sz="12" w:space="0" w:color="E6E6E6"/>
-              <w:bottom w:val="threeDEngrave" w:sz="12" w:space="0" w:color="E6E6E6"/>
-              <w:right w:val="threeDEngrave" w:sz="12" w:space="0" w:color="E6E6E6"/>
-            </w:tcBorders>
-            <w:vAlign w:val="center"/>
-          </w:tcPr>
-          <w:p>
-            <w:r>
-              <w:rPr>
-                <w:rFonts w:ascii="Arial" w:hAnsi="Arial" w:cs="Arial"/>
-                <w:b/>
-                <w:color w:val="000000"/>
-                <w:sz w:val="14"/>
-                <w:szCs w:val="14"/>
-              </w:rPr>
-              <w:t>$</w:t>
-            </w:r>
-          </w:p>
-        </w:tc>
-      </w:tr>
-      <w:tr>
-        <w:tblPrEx>
-          <w:tblCellMar>
-            <w:left w:w="108" w:type="dxa"/>
-            <w:right w:w="108" w:type="dxa"/>
-          </w:tblCellMar>
-        </w:tblPrEx>
-        <w:trPr>
-          <w:gridAfter w:val="1"/>
-          <w:wAfter w:w="12" w:type="dxa"/>
-        </w:trPr>
-        <w:tc>
-          <w:tcPr>
-            <w:tcW w:w="236" w:type="dxa"/>
-          </w:tcPr>
-          <w:p>
-            <w:pPr>
-              <w:snapToGrid w:val="0"/>
-            </w:pPr>
-          </w:p>
-        </w:tc>
-        <w:tc>
-          <w:tcPr>
-            <w:tcW w:w="7192" w:type="dxa"/>
-            <w:gridSpan w:val="31"/>
-            <w:tcBorders>
-              <w:left w:val="threeDEngrave" w:sz="12" w:space="0" w:color="E6E6E6"/>
-              <w:bottom w:val="threeDEngrave" w:sz="12" w:space="0" w:color="E6E6E6"/>
-            </w:tcBorders>
-            <w:shd w:val="clear" w:color="auto" w:fill="DDDDDD"/>
-            <w:vAlign w:val="center"/>
-          </w:tcPr>
-          <w:p>
-            <w:pPr>
-              <w:jc w:val="right"/>
-            </w:pPr>
-            <w:r>
-              <w:rPr>
-                <w:rFonts w:ascii="Arial" w:hAnsi="Arial" w:cs="Arial"/>
-                <w:b/>
-                <w:color w:val="000000"/>
-                <w:sz w:val="14"/>
-                <w:szCs w:val="14"/>
-              </w:rPr>
-              <w:t>Actualizaciones Según INPC:</w:t>
-            </w:r>
-          </w:p>
-        </w:tc>
-        <w:tc>
-          <w:tcPr>
-            <w:tcW w:w="3686" w:type="dxa"/>
-            <w:gridSpan w:val="16"/>
-            <w:tcBorders>
-              <w:left w:val="threeDEngrave" w:sz="12" w:space="0" w:color="E6E6E6"/>
-              <w:bottom w:val="threeDEngrave" w:sz="12" w:space="0" w:color="E6E6E6"/>
-              <w:right w:val="threeDEngrave" w:sz="12" w:space="0" w:color="E6E6E6"/>
-            </w:tcBorders>
-            <w:vAlign w:val="center"/>
-          </w:tcPr>
-          <w:p>
-            <w:r>
-              <w:rPr>
-                <w:rFonts w:ascii="Arial" w:hAnsi="Arial" w:cs="Arial"/>
-                <w:b/>
-                <w:color w:val="000000"/>
-                <w:sz w:val="14"/>
-                <w:szCs w:val="14"/>
-              </w:rPr>
-              <w:t>$</w:t>
-            </w:r>
-          </w:p>
-        </w:tc>
-      </w:tr>
-      <w:tr>
-        <w:tblPrEx>
-          <w:tblCellMar>
-            <w:left w:w="108" w:type="dxa"/>
-            <w:right w:w="108" w:type="dxa"/>
-          </w:tblCellMar>
-        </w:tblPrEx>
-        <w:trPr>
-          <w:gridAfter w:val="1"/>
-          <w:wAfter w:w="12" w:type="dxa"/>
-        </w:trPr>
-        <w:tc>
-          <w:tcPr>
-            <w:tcW w:w="236" w:type="dxa"/>
-          </w:tcPr>
-          <w:p>
-            <w:pPr>
-              <w:snapToGrid w:val="0"/>
-            </w:pPr>
-          </w:p>
-        </w:tc>
-        <w:tc>
-          <w:tcPr>
-            <w:tcW w:w="7192" w:type="dxa"/>
-            <w:gridSpan w:val="31"/>
-            <w:tcBorders>
-              <w:left w:val="threeDEngrave" w:sz="12" w:space="0" w:color="E6E6E6"/>
-              <w:bottom w:val="threeDEngrave" w:sz="12" w:space="0" w:color="E6E6E6"/>
-            </w:tcBorders>
-            <w:shd w:val="clear" w:color="auto" w:fill="DDDDDD"/>
-            <w:vAlign w:val="center"/>
-          </w:tcPr>
-          <w:p>
-            <w:pPr>
-              <w:jc w:val="right"/>
-            </w:pPr>
-            <w:r>
-              <w:rPr>
-                <w:rFonts w:ascii="Arial" w:hAnsi="Arial" w:cs="Arial"/>
-                <w:b/>
-                <w:color w:val="000000"/>
-                <w:sz w:val="14"/>
-                <w:szCs w:val="14"/>
-              </w:rPr>
-              <w:t>TOTAL:</w:t>
-            </w:r>
-          </w:p>
-        </w:tc>
-        <w:tc>
-          <w:tcPr>
-            <w:tcW w:w="3686" w:type="dxa"/>
-            <w:gridSpan w:val="16"/>
-            <w:tcBorders>
-              <w:left w:val="threeDEngrave" w:sz="12" w:space="0" w:color="E6E6E6"/>
-              <w:bottom w:val="threeDEngrave" w:sz="12" w:space="0" w:color="E6E6E6"/>
-              <w:right w:val="threeDEngrave" w:sz="12" w:space="0" w:color="E6E6E6"/>
-            </w:tcBorders>
-            <w:vAlign w:val="center"/>
-          </w:tcPr>
-          <w:p>
-            <w:r>
-              <w:rPr>
-                <w:rFonts w:ascii="Arial" w:hAnsi="Arial" w:cs="Arial"/>
-                <w:b/>
-                <w:color w:val="000000"/>
-                <w:sz w:val="14"/>
-                <w:szCs w:val="14"/>
-              </w:rPr>
-              <w:t>$</w:t>
-            </w:r>
-            <w:r>
-              <w:rPr>
-                <w:rFonts w:ascii="Arial" w:hAnsi="Arial" w:cs="Arial"/>
-                <w:b/>
-                <w:color w:val="000000"/>
-                <w:sz w:val="14"/>
-                <w:szCs w:val="14"/>
-              </w:rPr>
-              <w:t xml:space="preserve"> </w:t>
-            </w:r>
-            <w:r>
-              <w:rPr>
-                <w:rFonts w:ascii="Arial" w:hAnsi="Arial" w:cs="Arial"/>
-                <w:b/>
-                <w:color w:val="000000"/>
-                <w:sz w:val="14"/>
-                <w:szCs w:val="14"/>
-              </w:rPr>
-              <w:t>{{ total_liquidacion }}</w:t>
-            </w:r>
-          </w:p>
-        </w:tc>
-      </w:tr>
-      <w:tr>
-        <w:tblPrEx>
-          <w:tblCellMar>
-            <w:left w:w="108" w:type="dxa"/>
-            <w:right w:w="108" w:type="dxa"/>
-          </w:tblCellMar>
-        </w:tblPrEx>
-        <w:trPr>
-          <w:gridAfter w:val="1"/>
-          <w:wAfter w:w="12" w:type="dxa"/>
-        </w:trPr>
-        <w:tc>
-          <w:tcPr>
-            <w:tcW w:w="236" w:type="dxa"/>
-          </w:tcPr>
-          <w:p>
-            <w:pPr>
-              <w:snapToGrid w:val="0"/>
-            </w:pPr>
-          </w:p>
-        </w:tc>
-        <w:tc>
-          <w:tcPr>
             <w:tcW w:w="10878" w:type="dxa"/>
-            <w:gridSpan w:val="47"/>
+            <w:gridSpan w:val="46"/>
             <w:tcBorders>
               <w:left w:val="threeDEngrave" w:sz="12" w:space="0" w:color="E6E6E6"/>
               <w:bottom w:val="threeDEngrave" w:sz="12" w:space="0" w:color="E6E6E6"/>
@@ -4732,6 +4895,7 @@
           <w:sz w:val="14"/>
           <w:szCs w:val="14"/>
         </w:rPr>
+        <w:lastRenderedPageBreak/>
         <w:t>PARA OPERACIONES SIN INTERVENCIÓN NOTARIAL:</w:t>
       </w:r>
     </w:p>

</xml_diff>